<commit_message>
Validaciones al subir el csv
</commit_message>
<xml_diff>
--- a/reports/acif104_s9_grupo3.docx
+++ b/reports/acif104_s9_grupo3.docx
@@ -1,6 +1,6 @@
 
 <file path=word/document.xml><?xml version="1.0" encoding="utf-8"?>
-<w:document xmlns:wpc="http://schemas.microsoft.com/office/word/2010/wordprocessingCanvas" xmlns:cx="http://schemas.microsoft.com/office/drawing/2014/chartex" xmlns:cx1="http://schemas.microsoft.com/office/drawing/2015/9/8/chartex" xmlns:cx2="http://schemas.microsoft.com/office/drawing/2015/10/21/chartex" xmlns:cx3="http://schemas.microsoft.com/office/drawing/2016/5/9/chartex" xmlns:cx4="http://schemas.microsoft.com/office/drawing/2016/5/10/chartex" xmlns:cx5="http://schemas.microsoft.com/office/drawing/2016/5/11/chartex" xmlns:cx6="http://schemas.microsoft.com/office/drawing/2016/5/12/chartex" xmlns:cx7="http://schemas.microsoft.com/office/drawing/2016/5/13/chartex" xmlns:cx8="http://schemas.microsoft.com/office/drawing/2016/5/14/chartex" xmlns:mc="http://schemas.openxmlformats.org/markup-compatibility/2006" xmlns:aink="http://schemas.microsoft.com/office/drawing/2016/ink" xmlns:am3d="http://schemas.microsoft.com/office/drawing/2017/model3d" xmlns:o="urn:schemas-microsoft-com:office:office" xmlns:oel="http://schemas.microsoft.com/office/2019/extlst" xmlns:r="http://schemas.openxmlformats.org/officeDocument/2006/relationships" xmlns:m="http://schemas.openxmlformats.org/officeDocument/2006/math" xmlns:v="urn:schemas-microsoft-com:vml" xmlns:wp14="http://schemas.microsoft.com/office/word/2010/wordprocessingDrawing" xmlns:wp="http://schemas.openxmlformats.org/drawingml/2006/wordprocessingDrawing" xmlns:w10="urn:schemas-microsoft-com:office:word" xmlns:w="http://schemas.openxmlformats.org/wordprocessingml/2006/main" xmlns:w14="http://schemas.microsoft.com/office/word/2010/wordml" xmlns:w15="http://schemas.microsoft.com/office/word/2012/wordml" xmlns:w16cei="http://schemas.microsoft.com/office/word/2026/wordml/cei" xmlns:w16cex="http://schemas.microsoft.com/office/word/2018/wordml/cex" xmlns:w16cid="http://schemas.microsoft.com/office/word/2016/wordml/cid" xmlns:w16="http://schemas.microsoft.com/office/word/2018/wordml" xmlns:w16du="http://schemas.microsoft.com/office/word/2023/wordml/word16du" xmlns:w16sdtdh="http://schemas.microsoft.com/office/word/2020/wordml/sdtdatahash" xmlns:w16sdtfl="http://schemas.microsoft.com/office/word/2024/wordml/sdtformatlock" xmlns:w16se="http://schemas.microsoft.com/office/word/2015/wordml/symex" xmlns:wpg="http://schemas.microsoft.com/office/word/2010/wordprocessingGroup" xmlns:wpi="http://schemas.microsoft.com/office/word/2010/wordprocessingInk" xmlns:wne="http://schemas.microsoft.com/office/word/2006/wordml" xmlns:wps="http://schemas.microsoft.com/office/word/2010/wordprocessingShape" mc:Ignorable="w14 w15 w16se w16cid w16 w16cex w16sdtdh w16sdtfl w16du wp14">
+<w:document xmlns:wpc="http://schemas.microsoft.com/office/word/2010/wordprocessingCanvas" xmlns:cx="http://schemas.microsoft.com/office/drawing/2014/chartex" xmlns:cx1="http://schemas.microsoft.com/office/drawing/2015/9/8/chartex" xmlns:cx2="http://schemas.microsoft.com/office/drawing/2015/10/21/chartex" xmlns:cx3="http://schemas.microsoft.com/office/drawing/2016/5/9/chartex" xmlns:cx4="http://schemas.microsoft.com/office/drawing/2016/5/10/chartex" xmlns:cx5="http://schemas.microsoft.com/office/drawing/2016/5/11/chartex" xmlns:cx6="http://schemas.microsoft.com/office/drawing/2016/5/12/chartex" xmlns:cx7="http://schemas.microsoft.com/office/drawing/2016/5/13/chartex" xmlns:cx8="http://schemas.microsoft.com/office/drawing/2016/5/14/chartex" xmlns:mc="http://schemas.openxmlformats.org/markup-compatibility/2006" xmlns:aink="http://schemas.microsoft.com/office/drawing/2016/ink" xmlns:am3d="http://schemas.microsoft.com/office/drawing/2017/model3d" xmlns:o="urn:schemas-microsoft-com:office:office" xmlns:r="http://schemas.openxmlformats.org/officeDocument/2006/relationships" xmlns:m="http://schemas.openxmlformats.org/officeDocument/2006/math" xmlns:v="urn:schemas-microsoft-com:vml" xmlns:wp14="http://schemas.microsoft.com/office/word/2010/wordprocessingDrawing" xmlns:wp="http://schemas.openxmlformats.org/drawingml/2006/wordprocessingDrawing" xmlns:w10="urn:schemas-microsoft-com:office:word" xmlns:w="http://schemas.openxmlformats.org/wordprocessingml/2006/main" xmlns:w14="http://schemas.microsoft.com/office/word/2010/wordml" xmlns:w15="http://schemas.microsoft.com/office/word/2012/wordml" xmlns:w16cex="http://schemas.microsoft.com/office/word/2018/wordml/cex" xmlns:w16cid="http://schemas.microsoft.com/office/word/2016/wordml/cid" xmlns:w16="http://schemas.microsoft.com/office/word/2018/wordml" xmlns:w16sdtdh="http://schemas.microsoft.com/office/word/2020/wordml/sdtdatahash" xmlns:w16se="http://schemas.microsoft.com/office/word/2015/wordml/symex" xmlns:wpg="http://schemas.microsoft.com/office/word/2010/wordprocessingGroup" xmlns:wpi="http://schemas.microsoft.com/office/word/2010/wordprocessingInk" xmlns:wne="http://schemas.microsoft.com/office/word/2006/wordml" xmlns:wps="http://schemas.microsoft.com/office/word/2010/wordprocessingShape" mc:Ignorable="w14 w15 w16se w16cid w16 w16cex w16sdtdh wp14">
   <w:body>
     <w:p>
       <w:pPr>
@@ -810,7 +810,7 @@
               </wp:inline>
             </w:drawing>
           </mc:Choice>
-          <mc:Fallback>
+          <mc:Fallback xmlns:w16sdtfl="http://schemas.microsoft.com/office/word/2024/wordml/sdtformatlock" xmlns:w16du="http://schemas.microsoft.com/office/word/2023/wordml/word16du" xmlns:w16cei="http://schemas.microsoft.com/office/word/2026/wordml/cei" xmlns:oel="http://schemas.microsoft.com/office/2019/extlst">
             <w:pict>
               <v:group w14:anchorId="68F10E85" id="Group 2" o:spid="_x0000_s1026" style="width:85.45pt;height:51.55pt;mso-position-horizontal-relative:char;mso-position-vertical-relative:line" coordsize="10852,6546" o:gfxdata="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">
                 <v:shape id="Graphic 3" o:spid="_x0000_s1027" style="position:absolute;left:122;top:167;width:2101;height:3099;visibility:visible;mso-wrap-style:square;v-text-anchor:top" coordsize="210185,309880" o:gfxdata="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" path="m209791,l188086,r,184061l181850,232548r-17516,33480l137327,285432r-34712,6261l71098,285811,45396,267038,28085,233684,21742,184061,21742,,,,,185381r8392,58937l30862,282681r32483,20806l101777,309753r41068,-6762l177287,281095r23690,-39451l209791,182219,209791,xe" fillcolor="#c6c4c4" stroked="f">
@@ -1584,7 +1584,25 @@
           <w:szCs w:val="24"/>
           <w:lang w:val="es-419" w:eastAsia="es-419"/>
         </w:rPr>
-        <w:t xml:space="preserve">Desde el punto de vista social y ético, una solución de este tipo debe ser cuidadosamente diseñada, ya que trabaja con datos de comportamiento de usuarios. Por ello, resulta necesario considerar requisitos de privacidad, anonimización, seguridad, </w:t>
+        <w:t xml:space="preserve">Desde el punto de vista social y ético, una solución de este tipo debe ser cuidadosamente diseñada, ya que trabaja con datos de comportamiento de usuarios. Por ello, resulta necesario considerar requisitos de privacidad, </w:t>
+      </w:r>
+      <w:proofErr w:type="spellStart"/>
+      <w:r>
+        <w:rPr>
+          <w:rFonts w:asciiTheme="minorHAnsi" w:eastAsia="Times New Roman" w:hAnsiTheme="minorHAnsi" w:cstheme="minorHAnsi"/>
+          <w:szCs w:val="24"/>
+          <w:lang w:val="es-419" w:eastAsia="es-419"/>
+        </w:rPr>
+        <w:t>anonimización</w:t>
+      </w:r>
+      <w:proofErr w:type="spellEnd"/>
+      <w:r>
+        <w:rPr>
+          <w:rFonts w:asciiTheme="minorHAnsi" w:eastAsia="Times New Roman" w:hAnsiTheme="minorHAnsi" w:cstheme="minorHAnsi"/>
+          <w:szCs w:val="24"/>
+          <w:lang w:val="es-419" w:eastAsia="es-419"/>
+        </w:rPr>
+        <w:t xml:space="preserve">, seguridad, </w:t>
       </w:r>
       <w:proofErr w:type="spellStart"/>
       <w:r>
@@ -2420,6 +2438,24 @@
     </w:p>
     <w:p>
       <w:pPr>
+        <w:spacing w:after="60" w:line="276" w:lineRule="auto"/>
+        <w:ind w:left="360"/>
+        <w:rPr>
+          <w:rFonts w:asciiTheme="minorHAnsi" w:hAnsiTheme="minorHAnsi" w:cstheme="minorHAnsi"/>
+        </w:rPr>
+      </w:pPr>
+    </w:p>
+    <w:p>
+      <w:pPr>
+        <w:spacing w:after="60" w:line="276" w:lineRule="auto"/>
+        <w:ind w:left="360"/>
+        <w:rPr>
+          <w:rFonts w:asciiTheme="minorHAnsi" w:hAnsiTheme="minorHAnsi" w:cstheme="minorHAnsi"/>
+        </w:rPr>
+      </w:pPr>
+    </w:p>
+    <w:p>
+      <w:pPr>
         <w:widowControl/>
         <w:autoSpaceDE/>
         <w:autoSpaceDN/>
@@ -2442,6 +2478,7 @@
           <w:szCs w:val="28"/>
           <w:lang w:val="es-419" w:eastAsia="es-419"/>
         </w:rPr>
+        <w:lastRenderedPageBreak/>
         <w:t>3.2 Fases metodológicas</w:t>
       </w:r>
     </w:p>
@@ -2457,14 +2494,7 @@
         <w:rPr>
           <w:rFonts w:asciiTheme="minorHAnsi" w:hAnsiTheme="minorHAnsi" w:cstheme="minorHAnsi"/>
         </w:rPr>
-        <w:t xml:space="preserve">Análisis exploratorio y preparación. Se revisaron las 32 variables, la completitud, los duplicados, la consistencia </w:t>
-      </w:r>
-      <w:r>
-        <w:rPr>
-          <w:rFonts w:asciiTheme="minorHAnsi" w:hAnsiTheme="minorHAnsi" w:cstheme="minorHAnsi"/>
-        </w:rPr>
-        <w:lastRenderedPageBreak/>
-        <w:t>categórica, la correctitud numérica y los valores atípicos. Luego se separaron entrenamiento, validación y prueba de forma estratificada, y el preprocesador se ajustó solo con entrenamiento.</w:t>
+        <w:t>Análisis exploratorio y preparación. Se revisaron las 32 variables, la completitud, los duplicados, la consistencia categórica, la correctitud numérica y los valores atípicos. Luego se separaron entrenamiento, validación y prueba de forma estratificada, y el preprocesador se ajustó solo con entrenamiento.</w:t>
       </w:r>
     </w:p>
     <w:p>
@@ -2479,13 +2509,27 @@
         <w:rPr>
           <w:rFonts w:asciiTheme="minorHAnsi" w:hAnsiTheme="minorHAnsi" w:cstheme="minorHAnsi"/>
         </w:rPr>
-        <w:t xml:space="preserve">Selección de técnicas. Se escogieron regresión logística, Random Forest y </w:t>
+        <w:t xml:space="preserve">Selección de técnicas. Se escogieron regresión logística, </w:t>
       </w:r>
       <w:proofErr w:type="spellStart"/>
       <w:r>
         <w:rPr>
           <w:rFonts w:asciiTheme="minorHAnsi" w:hAnsiTheme="minorHAnsi" w:cstheme="minorHAnsi"/>
         </w:rPr>
+        <w:t>Random</w:t>
+      </w:r>
+      <w:proofErr w:type="spellEnd"/>
+      <w:r>
+        <w:rPr>
+          <w:rFonts w:asciiTheme="minorHAnsi" w:hAnsiTheme="minorHAnsi" w:cstheme="minorHAnsi"/>
+        </w:rPr>
+        <w:t xml:space="preserve"> Forest y </w:t>
+      </w:r>
+      <w:proofErr w:type="spellStart"/>
+      <w:r>
+        <w:rPr>
+          <w:rFonts w:asciiTheme="minorHAnsi" w:hAnsiTheme="minorHAnsi" w:cstheme="minorHAnsi"/>
+        </w:rPr>
         <w:t>XGBoost</w:t>
       </w:r>
       <w:proofErr w:type="spellEnd"/>
@@ -2507,7 +2551,21 @@
         <w:rPr>
           <w:rFonts w:asciiTheme="minorHAnsi" w:hAnsiTheme="minorHAnsi" w:cstheme="minorHAnsi"/>
         </w:rPr>
-        <w:t xml:space="preserve"> del error (Rumelhart et al., 1986), y su comparación frente a modelos de árboles responde a evidencia reciente de que las redes neuronales no siempre superan a los métodos basados en árboles en datos tabulares (Borisov et al., 2024).</w:t>
+        <w:t xml:space="preserve"> del error (</w:t>
+      </w:r>
+      <w:proofErr w:type="spellStart"/>
+      <w:r>
+        <w:rPr>
+          <w:rFonts w:asciiTheme="minorHAnsi" w:hAnsiTheme="minorHAnsi" w:cstheme="minorHAnsi"/>
+        </w:rPr>
+        <w:t>Rumelhart</w:t>
+      </w:r>
+      <w:proofErr w:type="spellEnd"/>
+      <w:r>
+        <w:rPr>
+          <w:rFonts w:asciiTheme="minorHAnsi" w:hAnsiTheme="minorHAnsi" w:cstheme="minorHAnsi"/>
+        </w:rPr>
+        <w:t xml:space="preserve"> et al., 1986), y su comparación frente a modelos de árboles responde a evidencia reciente de que las redes neuronales no siempre superan a los métodos basados en árboles en datos tabulares (Borisov et al., 2024).</w:t>
       </w:r>
     </w:p>
     <w:p>
@@ -3516,7 +3574,6 @@
         <w:rPr>
           <w:rFonts w:asciiTheme="minorHAnsi" w:hAnsiTheme="minorHAnsi" w:cstheme="minorHAnsi"/>
           <w:i/>
-          <w:iCs/>
           <w:sz w:val="18"/>
           <w:szCs w:val="18"/>
         </w:rPr>
@@ -3525,6 +3582,8 @@
         <w:rPr>
           <w:rFonts w:asciiTheme="minorHAnsi" w:hAnsiTheme="minorHAnsi" w:cstheme="minorHAnsi"/>
           <w:i/>
+          <w:sz w:val="18"/>
+          <w:szCs w:val="18"/>
         </w:rPr>
         <w:t>Fuente: elaboración propia.</w:t>
       </w:r>
@@ -3546,7 +3605,15 @@
           <w:lang w:val="es-419" w:eastAsia="es-419"/>
         </w:rPr>
       </w:pPr>
-      <w:r>
+    </w:p>
+    <w:p>
+      <w:pPr>
+        <w:widowControl/>
+        <w:autoSpaceDE/>
+        <w:autoSpaceDN/>
+        <w:spacing w:before="100" w:beforeAutospacing="1" w:after="100" w:afterAutospacing="1" w:line="276" w:lineRule="auto"/>
+        <w:jc w:val="both"/>
+        <w:outlineLvl w:val="1"/>
         <w:rPr>
           <w:rFonts w:asciiTheme="minorHAnsi" w:eastAsia="Times New Roman" w:hAnsiTheme="minorHAnsi" w:cstheme="minorHAnsi"/>
           <w:b/>
@@ -3555,6 +3622,53 @@
           <w:szCs w:val="44"/>
           <w:lang w:val="es-419" w:eastAsia="es-419"/>
         </w:rPr>
+      </w:pPr>
+    </w:p>
+    <w:p>
+      <w:pPr>
+        <w:widowControl/>
+        <w:autoSpaceDE/>
+        <w:autoSpaceDN/>
+        <w:spacing w:before="100" w:beforeAutospacing="1" w:after="100" w:afterAutospacing="1" w:line="276" w:lineRule="auto"/>
+        <w:jc w:val="both"/>
+        <w:outlineLvl w:val="1"/>
+        <w:rPr>
+          <w:rFonts w:asciiTheme="minorHAnsi" w:eastAsia="Times New Roman" w:hAnsiTheme="minorHAnsi" w:cstheme="minorHAnsi"/>
+          <w:b/>
+          <w:bCs/>
+          <w:sz w:val="28"/>
+          <w:szCs w:val="44"/>
+          <w:lang w:val="es-419" w:eastAsia="es-419"/>
+        </w:rPr>
+      </w:pPr>
+    </w:p>
+    <w:p>
+      <w:pPr>
+        <w:widowControl/>
+        <w:autoSpaceDE/>
+        <w:autoSpaceDN/>
+        <w:spacing w:before="100" w:beforeAutospacing="1" w:after="100" w:afterAutospacing="1" w:line="276" w:lineRule="auto"/>
+        <w:jc w:val="both"/>
+        <w:outlineLvl w:val="1"/>
+        <w:rPr>
+          <w:rFonts w:asciiTheme="minorHAnsi" w:eastAsia="Times New Roman" w:hAnsiTheme="minorHAnsi" w:cstheme="minorHAnsi"/>
+          <w:b/>
+          <w:bCs/>
+          <w:sz w:val="28"/>
+          <w:szCs w:val="44"/>
+          <w:lang w:val="es-419" w:eastAsia="es-419"/>
+        </w:rPr>
+      </w:pPr>
+      <w:r>
+        <w:rPr>
+          <w:rFonts w:asciiTheme="minorHAnsi" w:eastAsia="Times New Roman" w:hAnsiTheme="minorHAnsi" w:cstheme="minorHAnsi"/>
+          <w:b/>
+          <w:bCs/>
+          <w:sz w:val="28"/>
+          <w:szCs w:val="44"/>
+          <w:lang w:val="es-419" w:eastAsia="es-419"/>
+        </w:rPr>
+        <w:lastRenderedPageBreak/>
         <w:t>IV. Desarrollo del proyecto</w:t>
       </w:r>
     </w:p>
@@ -3613,14 +3727,7 @@
         <w:rPr>
           <w:rFonts w:asciiTheme="minorHAnsi" w:hAnsiTheme="minorHAnsi" w:cstheme="minorHAnsi"/>
         </w:rPr>
-        <w:t xml:space="preserve">Se utilizó Customer Churn Prediction Business Dataset (Miah, 2025), un conjunto sintético de 10.000 clientes, 30 variables predictoras, customer_id y la etiqueta churn. La revisión confirmó completitud y ausencia de duplicados; corrigió la interpretación de complaint_type y conservó valores extremos plausibles. La clase positiva representa </w:t>
-      </w:r>
-      <w:r>
-        <w:rPr>
-          <w:rFonts w:asciiTheme="minorHAnsi" w:hAnsiTheme="minorHAnsi" w:cstheme="minorHAnsi"/>
-        </w:rPr>
-        <w:lastRenderedPageBreak/>
-        <w:t>cerca del 10 %, por lo que accuracy no es suficiente para seleccionar el modelo.</w:t>
+        <w:t>Se utilizó Customer Churn Prediction Business Dataset (Miah, 2025), un conjunto sintético de 10.000 clientes, 30 variables predictoras, customer_id y la etiqueta churn. La revisión confirmó completitud y ausencia de duplicados; corrigió la interpretación de complaint_type y conservó valores extremos plausibles. La clase positiva representa cerca del 10 %, por lo que accuracy no es suficiente para seleccionar el modelo.</w:t>
       </w:r>
     </w:p>
     <w:p>
@@ -4807,19 +4914,20 @@
       <w:pPr>
         <w:keepNext/>
         <w:spacing w:after="120" w:line="276" w:lineRule="auto"/>
-        <w:jc w:val="center"/>
         <w:rPr>
           <w:rFonts w:asciiTheme="minorHAnsi" w:hAnsiTheme="minorHAnsi" w:cstheme="minorHAnsi"/>
           <w:i/>
           <w:iCs/>
+          <w:sz w:val="14"/>
+          <w:szCs w:val="14"/>
+        </w:rPr>
+      </w:pPr>
+      <w:r>
+        <w:rPr>
+          <w:rFonts w:asciiTheme="minorHAnsi" w:hAnsiTheme="minorHAnsi" w:cstheme="minorHAnsi"/>
+          <w:i/>
           <w:sz w:val="18"/>
           <w:szCs w:val="18"/>
-        </w:rPr>
-      </w:pPr>
-      <w:r>
-        <w:rPr>
-          <w:rFonts w:asciiTheme="minorHAnsi" w:hAnsiTheme="minorHAnsi" w:cstheme="minorHAnsi"/>
-          <w:i/>
         </w:rPr>
         <w:t>Fuente: elaboración propia.</w:t>
       </w:r>
@@ -4883,6 +4991,15 @@
     </w:p>
     <w:p>
       <w:pPr>
+        <w:spacing w:after="120" w:line="276" w:lineRule="auto"/>
+        <w:jc w:val="both"/>
+        <w:rPr>
+          <w:rFonts w:asciiTheme="minorHAnsi" w:hAnsiTheme="minorHAnsi" w:cstheme="minorHAnsi"/>
+        </w:rPr>
+      </w:pPr>
+    </w:p>
+    <w:p>
+      <w:pPr>
         <w:keepNext/>
         <w:spacing w:line="276" w:lineRule="auto"/>
         <w:rPr>
@@ -4894,6 +5011,7 @@
           <w:rFonts w:asciiTheme="minorHAnsi" w:hAnsiTheme="minorHAnsi" w:cstheme="minorHAnsi"/>
           <w:i/>
         </w:rPr>
+        <w:lastRenderedPageBreak/>
         <w:t>Tabla 3. Matriz resumida de requisitos y trazabilidad</w:t>
       </w:r>
     </w:p>
@@ -5673,16 +5791,17 @@
           <w:rFonts w:asciiTheme="minorHAnsi" w:hAnsiTheme="minorHAnsi" w:cstheme="minorHAnsi"/>
           <w:i/>
           <w:iCs/>
+          <w:sz w:val="14"/>
+          <w:szCs w:val="14"/>
+        </w:rPr>
+      </w:pPr>
+      <w:r>
+        <w:rPr>
+          <w:rFonts w:asciiTheme="minorHAnsi" w:hAnsiTheme="minorHAnsi" w:cstheme="minorHAnsi"/>
+          <w:i/>
           <w:sz w:val="18"/>
           <w:szCs w:val="18"/>
         </w:rPr>
-      </w:pPr>
-      <w:r>
-        <w:rPr>
-          <w:rFonts w:asciiTheme="minorHAnsi" w:hAnsiTheme="minorHAnsi" w:cstheme="minorHAnsi"/>
-          <w:i/>
-        </w:rPr>
-        <w:lastRenderedPageBreak/>
         <w:t>Fuente: elaboración propia.</w:t>
       </w:r>
     </w:p>
@@ -5803,6 +5922,7 @@
       <w:pPr>
         <w:keepNext/>
         <w:spacing w:line="276" w:lineRule="auto"/>
+        <w:jc w:val="center"/>
         <w:rPr>
           <w:rFonts w:asciiTheme="minorHAnsi" w:hAnsiTheme="minorHAnsi" w:cstheme="minorHAnsi"/>
         </w:rPr>
@@ -5850,6 +5970,15 @@
         </w:rPr>
         <w:t>Como modelo global se seleccionó XGBoost + ROS por recall 0,843, ROC-AUC 0,826 y PR-AUC 0,333. Luego se ejecutó RandomizedSearchCV con 35 combinaciones y 5 pliegues solo dentro de entrenamiento, optimizando PR-AUC. La configuración refinada usó profundidad 2, learning rate 0,02, 250 árboles, subsample 0,7 y colsample_bytree 0,7. Con los hiperparámetros congelados, el umbral 0,56 se eligió en validación bajo la restricción recall &gt;= 0,80; maximizar F1 sin esa restricción habría reducido el recall a 0,569. El modelo y el umbral quedaron registrados mediante hashes antes de abrir prueba. Las curvas y tablas de refinamiento completas están en los Anexos C e I.</w:t>
       </w:r>
+    </w:p>
+    <w:p>
+      <w:pPr>
+        <w:spacing w:after="120" w:line="276" w:lineRule="auto"/>
+        <w:jc w:val="both"/>
+        <w:rPr>
+          <w:rFonts w:asciiTheme="minorHAnsi" w:hAnsiTheme="minorHAnsi" w:cstheme="minorHAnsi"/>
+        </w:rPr>
+      </w:pPr>
     </w:p>
     <w:p>
       <w:pPr>
@@ -5872,6 +6001,7 @@
           <w:rFonts w:asciiTheme="minorHAnsi" w:hAnsiTheme="minorHAnsi" w:cstheme="minorHAnsi"/>
           <w:b/>
         </w:rPr>
+        <w:lastRenderedPageBreak/>
         <w:t>4.4 Elaboración de modelos</w:t>
       </w:r>
     </w:p>
@@ -5919,7 +6049,6 @@
           <w:rFonts w:asciiTheme="minorHAnsi" w:hAnsiTheme="minorHAnsi" w:cstheme="minorHAnsi"/>
           <w:i/>
         </w:rPr>
-        <w:lastRenderedPageBreak/>
         <w:t>Tabla 4. Mejor estrategia de balanceo por modelo en validación</w:t>
       </w:r>
     </w:p>
@@ -6476,20 +6605,21 @@
       <w:pPr>
         <w:keepNext/>
         <w:spacing w:after="120" w:line="276" w:lineRule="auto"/>
-        <w:jc w:val="center"/>
         <w:rPr>
           <w:rFonts w:asciiTheme="minorHAnsi" w:hAnsiTheme="minorHAnsi" w:cstheme="minorHAnsi"/>
           <w:i/>
           <w:iCs/>
+          <w:sz w:val="14"/>
+          <w:szCs w:val="14"/>
+        </w:rPr>
+      </w:pPr>
+      <w:r>
+        <w:rPr>
+          <w:rFonts w:asciiTheme="minorHAnsi" w:hAnsiTheme="minorHAnsi" w:cstheme="minorHAnsi"/>
+          <w:i/>
           <w:sz w:val="18"/>
           <w:szCs w:val="18"/>
         </w:rPr>
-      </w:pPr>
-      <w:r>
-        <w:rPr>
-          <w:rFonts w:asciiTheme="minorHAnsi" w:hAnsiTheme="minorHAnsi" w:cstheme="minorHAnsi"/>
-          <w:i/>
-        </w:rPr>
         <w:t>Fuente: elaboración propia.</w:t>
       </w:r>
     </w:p>
@@ -6505,8 +6635,31 @@
         <w:rPr>
           <w:rFonts w:asciiTheme="minorHAnsi" w:hAnsiTheme="minorHAnsi" w:cstheme="minorHAnsi"/>
         </w:rPr>
-        <w:t>ROS se eligió para los tres modelos. En Random Forest, pesos alcanzó F1 0,407 y ROS 0,406; se prefirió ROS porque elevó el recall de 0,614 a 0,752. Los doce escenarios completos y su gráfico comparativo se presentan en los Anexos D e I.</w:t>
-      </w:r>
+        <w:t xml:space="preserve">ROS se eligió para los tres modelos. En Random Forest, pesos alcanzó F1 0,407 y ROS 0,406; se prefirió ROS porque elevó el recall de 0,614 a 0,752. Los doce escenarios completos y su gráfico comparativo se presentan en los Anexos </w:t>
+      </w:r>
+      <w:proofErr w:type="spellStart"/>
+      <w:r>
+        <w:rPr>
+          <w:rFonts w:asciiTheme="minorHAnsi" w:hAnsiTheme="minorHAnsi" w:cstheme="minorHAnsi"/>
+        </w:rPr>
+        <w:t>D e</w:t>
+      </w:r>
+      <w:proofErr w:type="spellEnd"/>
+      <w:r>
+        <w:rPr>
+          <w:rFonts w:asciiTheme="minorHAnsi" w:hAnsiTheme="minorHAnsi" w:cstheme="minorHAnsi"/>
+        </w:rPr>
+        <w:t xml:space="preserve"> I.</w:t>
+      </w:r>
+    </w:p>
+    <w:p>
+      <w:pPr>
+        <w:spacing w:after="120" w:line="276" w:lineRule="auto"/>
+        <w:jc w:val="both"/>
+        <w:rPr>
+          <w:rFonts w:asciiTheme="minorHAnsi" w:hAnsiTheme="minorHAnsi" w:cstheme="minorHAnsi"/>
+        </w:rPr>
+      </w:pPr>
     </w:p>
     <w:p>
       <w:pPr>
@@ -6622,12 +6775,21 @@
         </w:rPr>
         <w:t xml:space="preserve">En la versión base, el backend se divide en módulos responsables de validar las 30 variables de entrada, cargar los artefactos entrenados, ejecutar predicciones individuales, consultar clientes del conjunto de validación y registrar el monitoreo. </w:t>
       </w:r>
+      <w:proofErr w:type="spellStart"/>
       <w:r>
         <w:rPr>
           <w:rFonts w:asciiTheme="minorHAnsi" w:hAnsiTheme="minorHAnsi" w:cstheme="minorHAnsi"/>
           <w:lang w:val="en-US"/>
         </w:rPr>
-        <w:t xml:space="preserve">Esa </w:t>
+        <w:t>Esa</w:t>
+      </w:r>
+      <w:proofErr w:type="spellEnd"/>
+      <w:r>
+        <w:rPr>
+          <w:rFonts w:asciiTheme="minorHAnsi" w:hAnsiTheme="minorHAnsi" w:cstheme="minorHAnsi"/>
+          <w:lang w:val="en-US"/>
+        </w:rPr>
+        <w:t xml:space="preserve"> </w:t>
       </w:r>
       <w:proofErr w:type="spellStart"/>
       <w:r>
@@ -6729,6 +6891,7 @@
           <w:rFonts w:asciiTheme="minorHAnsi" w:hAnsiTheme="minorHAnsi" w:cstheme="minorHAnsi"/>
           <w:noProof/>
         </w:rPr>
+        <w:lastRenderedPageBreak/>
         <w:drawing>
           <wp:inline distT="0" distB="0" distL="0" distR="0" wp14:anchorId="22A567F8" wp14:editId="23103595">
             <wp:extent cx="3219450" cy="2146300"/>
@@ -6914,14 +7077,7 @@
         <w:rPr>
           <w:rFonts w:asciiTheme="minorHAnsi" w:hAnsiTheme="minorHAnsi" w:cstheme="minorHAnsi"/>
         </w:rPr>
-        <w:t xml:space="preserve">, la configuración </w:t>
-      </w:r>
-      <w:r>
-        <w:rPr>
-          <w:rFonts w:asciiTheme="minorHAnsi" w:hAnsiTheme="minorHAnsi" w:cstheme="minorHAnsi"/>
-        </w:rPr>
-        <w:lastRenderedPageBreak/>
-        <w:t>de umbrales y el explicador SHAP. De esta manera, los artefactos no se vuelven a cargar en cada solicitud.</w:t>
+        <w:t>, la configuración de umbrales y el explicador SHAP. De esta manera, los artefactos no se vuelven a cargar en cada solicitud.</w:t>
       </w:r>
     </w:p>
     <w:p>
@@ -6971,28 +7127,14 @@
         <w:rPr>
           <w:rFonts w:asciiTheme="minorHAnsi" w:hAnsiTheme="minorHAnsi" w:cstheme="minorHAnsi"/>
         </w:rPr>
-        <w:t>predict_</w:t>
-      </w:r>
-      <w:proofErr w:type="gramStart"/>
-      <w:r>
-        <w:rPr>
-          <w:rFonts w:asciiTheme="minorHAnsi" w:hAnsiTheme="minorHAnsi" w:cstheme="minorHAnsi"/>
-        </w:rPr>
-        <w:t>proba</w:t>
+        <w:t>predict_proba</w:t>
       </w:r>
       <w:proofErr w:type="spellEnd"/>
       <w:r>
         <w:rPr>
           <w:rFonts w:asciiTheme="minorHAnsi" w:hAnsiTheme="minorHAnsi" w:cstheme="minorHAnsi"/>
         </w:rPr>
-        <w:t>(</w:t>
-      </w:r>
-      <w:proofErr w:type="gramEnd"/>
-      <w:r>
-        <w:rPr>
-          <w:rFonts w:asciiTheme="minorHAnsi" w:hAnsiTheme="minorHAnsi" w:cstheme="minorHAnsi"/>
-        </w:rPr>
-        <w:t>).</w:t>
+        <w:t>().</w:t>
       </w:r>
     </w:p>
     <w:p>
@@ -7115,6 +7257,7 @@
         <w:rPr>
           <w:rFonts w:asciiTheme="minorHAnsi" w:hAnsiTheme="minorHAnsi" w:cstheme="minorHAnsi"/>
         </w:rPr>
+        <w:lastRenderedPageBreak/>
         <w:t>Este cambio busca responder a la pregunta operativa de una empresa: cuántos clientes están en riesgo, quiénes deben atenderse primero y qué factores explican cada alerta. El contrato definido para POST /predict/batch admite entre 1 y 100 clientes por solicitud, valida cada fila de forma independiente y permite informar éxitos y errores parciales sin descartar una cartera completa por un único registro inválido.</w:t>
       </w:r>
     </w:p>
@@ -7146,8 +7289,8 @@
       <w:r>
         <w:rPr>
           <w:rFonts w:asciiTheme="minorHAnsi" w:hAnsiTheme="minorHAnsi" w:cstheme="minorHAnsi"/>
-        </w:rPr>
-        <w:lastRenderedPageBreak/>
+          <w:noProof/>
+        </w:rPr>
         <w:drawing>
           <wp:inline distT="0" distB="0" distL="0" distR="0" wp14:anchorId="69C2F0C6" wp14:editId="5C3F9DE5">
             <wp:extent cx="3619500" cy="3150499"/>
@@ -7187,22 +7330,6 @@
     </w:p>
     <w:p>
       <w:pPr>
-        <w:spacing w:line="276" w:lineRule="auto"/>
-        <w:rPr>
-          <w:rFonts w:asciiTheme="minorHAnsi" w:hAnsiTheme="minorHAnsi" w:cstheme="minorHAnsi"/>
-        </w:rPr>
-      </w:pPr>
-    </w:p>
-    <w:p>
-      <w:pPr>
-        <w:spacing w:line="276" w:lineRule="auto"/>
-        <w:rPr>
-          <w:rFonts w:asciiTheme="minorHAnsi" w:hAnsiTheme="minorHAnsi" w:cstheme="minorHAnsi"/>
-        </w:rPr>
-      </w:pPr>
-    </w:p>
-    <w:p>
-      <w:pPr>
         <w:spacing w:before="80" w:after="40" w:line="276" w:lineRule="auto"/>
         <w:jc w:val="center"/>
         <w:rPr>
@@ -7248,6 +7375,15 @@
         </w:rPr>
         <w:t>La tabla priorizada, la ficha SHAP y la evidencia definitiva de las pruebas automatizadas se presentan en el Anexo K.</w:t>
       </w:r>
+    </w:p>
+    <w:p>
+      <w:pPr>
+        <w:spacing w:after="120" w:line="276" w:lineRule="auto"/>
+        <w:jc w:val="both"/>
+        <w:rPr>
+          <w:rFonts w:asciiTheme="minorHAnsi" w:hAnsiTheme="minorHAnsi" w:cstheme="minorHAnsi"/>
+        </w:rPr>
+      </w:pPr>
     </w:p>
     <w:p>
       <w:pPr>
@@ -7350,6 +7486,7 @@
           <w:szCs w:val="44"/>
           <w:lang w:val="es-419" w:eastAsia="es-419"/>
         </w:rPr>
+        <w:lastRenderedPageBreak/>
         <w:t>V. Resultados</w:t>
       </w:r>
     </w:p>
@@ -7915,7 +8052,14 @@
         <w:rPr>
           <w:rFonts w:asciiTheme="minorHAnsi" w:hAnsiTheme="minorHAnsi" w:cstheme="minorHAnsi"/>
         </w:rPr>
-        <w:t>En validación, la mejora fue moderada pero consistente y no comprometió el recall. El hallazgo metodológico más relevante fue comprobar que optimizar F1 sin una restricción de negocio reducía demasiado la detección de abandonos. Por ello, el umbral definitivo se fijó antes de abrir prueba, manteniendo recall ≥ 0,80 en validación (sección 4.3 y Anexo I). La evaluación de prueba se utilizó una sola vez para estimar el desempeño final, no para modificar decisiones.</w:t>
+        <w:t xml:space="preserve">En validación, la mejora fue moderada pero consistente y no comprometió el recall. El hallazgo metodológico más relevante fue comprobar que optimizar F1 sin una restricción de negocio reducía demasiado la detección de </w:t>
+      </w:r>
+      <w:r>
+        <w:rPr>
+          <w:rFonts w:asciiTheme="minorHAnsi" w:hAnsiTheme="minorHAnsi" w:cstheme="minorHAnsi"/>
+        </w:rPr>
+        <w:lastRenderedPageBreak/>
+        <w:t>abandonos. Por ello, el umbral definitivo se fijó antes de abrir prueba, manteniendo recall ≥ 0,80 en validación (sección 4.3 y Anexo I). La evaluación de prueba se utilizó una sola vez para estimar el desempeño final, no para modificar decisiones.</w:t>
       </w:r>
     </w:p>
     <w:p>
@@ -7942,7 +8086,6 @@
           <w:b/>
           <w:sz w:val="23"/>
         </w:rPr>
-        <w:lastRenderedPageBreak/>
         <w:t>5.2 Interpretación de resultados con SHAP</w:t>
       </w:r>
     </w:p>
@@ -8656,9 +8799,9 @@
         </w:rPr>
         <w:lastRenderedPageBreak/>
         <w:drawing>
-          <wp:inline distT="0" distB="0" distL="0" distR="0" wp14:anchorId="28B9B00A" wp14:editId="76A338AF">
-            <wp:extent cx="2913194" cy="3238500"/>
-            <wp:effectExtent l="0" t="0" r="1905" b="0"/>
+          <wp:inline distT="0" distB="0" distL="0" distR="0" wp14:anchorId="28B9B00A" wp14:editId="296C76E1">
+            <wp:extent cx="2655736" cy="2952292"/>
+            <wp:effectExtent l="0" t="0" r="0" b="635"/>
             <wp:docPr id="1950181908" name="Picture 1950181908"/>
             <wp:cNvGraphicFramePr>
               <a:graphicFrameLocks xmlns:a="http://schemas.openxmlformats.org/drawingml/2006/main" noChangeAspect="1"/>
@@ -8679,7 +8822,7 @@
                   <pic:spPr>
                     <a:xfrm>
                       <a:off x="0" y="0"/>
-                      <a:ext cx="2922746" cy="3249118"/>
+                      <a:ext cx="2670210" cy="2968382"/>
                     </a:xfrm>
                     <a:prstGeom prst="rect">
                       <a:avLst/>
@@ -8923,18 +9066,8 @@
         <w:rPr>
           <w:rFonts w:asciiTheme="minorHAnsi" w:hAnsiTheme="minorHAnsi" w:cstheme="minorHAnsi"/>
         </w:rPr>
-        <w:lastRenderedPageBreak/>
         <w:t>El cumplimiento detallado de los requisitos del prototipo y del proyecto se presenta en el Anexo O.</w:t>
       </w:r>
-    </w:p>
-    <w:p>
-      <w:pPr>
-        <w:spacing w:after="120" w:line="276" w:lineRule="auto"/>
-        <w:jc w:val="both"/>
-        <w:rPr>
-          <w:rFonts w:asciiTheme="minorHAnsi" w:hAnsiTheme="minorHAnsi" w:cstheme="minorHAnsi"/>
-        </w:rPr>
-      </w:pPr>
     </w:p>
     <w:p>
       <w:pPr>
@@ -8962,6 +9095,7 @@
           <w:szCs w:val="44"/>
           <w:lang w:val="es-419" w:eastAsia="es-419"/>
         </w:rPr>
+        <w:lastRenderedPageBreak/>
         <w:t>VI. Propuesta de mejoras</w:t>
       </w:r>
     </w:p>
@@ -9023,7 +9157,7 @@
       </w:pPr>
       <w:r>
         <w:rPr>
-          <w:rStyle w:val="Fuerte"/>
+          <w:rStyle w:val="Textoennegrita"/>
           <w:rFonts w:asciiTheme="minorHAnsi" w:hAnsiTheme="minorHAnsi" w:cstheme="minorHAnsi"/>
           <w:b w:val="0"/>
           <w:bCs w:val="0"/>
@@ -9032,7 +9166,7 @@
       </w:r>
       <w:r>
         <w:rPr>
-          <w:rStyle w:val="Fuerte"/>
+          <w:rStyle w:val="Textoennegrita"/>
           <w:rFonts w:asciiTheme="minorHAnsi" w:hAnsiTheme="minorHAnsi" w:cstheme="minorHAnsi"/>
           <w:b w:val="0"/>
           <w:bCs w:val="0"/>
@@ -10262,8 +10396,9 @@
           <w:rPr>
             <w:rStyle w:val="Hipervnculo"/>
             <w:rFonts w:asciiTheme="minorHAnsi" w:hAnsiTheme="minorHAnsi" w:cstheme="minorHAnsi"/>
+            <w:lang w:val="en-US"/>
           </w:rPr>
-          <w:t>https://github.com/gveraprado-wited/acif104-churn-grupo3</w:t>
+          <w:t>https://github.com/gveraprado-wited/acif104_s9_equipo3</w:t>
         </w:r>
       </w:hyperlink>
     </w:p>
@@ -10392,7 +10527,21 @@
         <w:rPr>
           <w:rFonts w:asciiTheme="minorHAnsi" w:eastAsia="Calibri" w:hAnsiTheme="minorHAnsi" w:cstheme="minorHAnsi"/>
         </w:rPr>
-        <w:t xml:space="preserve"> Churn </w:t>
+        <w:t xml:space="preserve"> </w:t>
+      </w:r>
+      <w:proofErr w:type="spellStart"/>
+      <w:r>
+        <w:rPr>
+          <w:rFonts w:asciiTheme="minorHAnsi" w:eastAsia="Calibri" w:hAnsiTheme="minorHAnsi" w:cstheme="minorHAnsi"/>
+        </w:rPr>
+        <w:t>Churn</w:t>
+      </w:r>
+      <w:proofErr w:type="spellEnd"/>
+      <w:r>
+        <w:rPr>
+          <w:rFonts w:asciiTheme="minorHAnsi" w:eastAsia="Calibri" w:hAnsiTheme="minorHAnsi" w:cstheme="minorHAnsi"/>
+        </w:rPr>
+        <w:t xml:space="preserve"> </w:t>
       </w:r>
       <w:proofErr w:type="spellStart"/>
       <w:r>
@@ -11101,7 +11250,23 @@
                 <w:rFonts w:asciiTheme="minorHAnsi" w:eastAsia="Calibri" w:hAnsiTheme="minorHAnsi" w:cstheme="minorHAnsi"/>
                 <w:sz w:val="14"/>
               </w:rPr>
-              <w:t>, Germany, India, UK, USA</w:t>
+              <w:t xml:space="preserve">, </w:t>
+            </w:r>
+            <w:proofErr w:type="spellStart"/>
+            <w:r>
+              <w:rPr>
+                <w:rFonts w:asciiTheme="minorHAnsi" w:eastAsia="Calibri" w:hAnsiTheme="minorHAnsi" w:cstheme="minorHAnsi"/>
+                <w:sz w:val="14"/>
+              </w:rPr>
+              <w:t>Germany</w:t>
+            </w:r>
+            <w:proofErr w:type="spellEnd"/>
+            <w:r>
+              <w:rPr>
+                <w:rFonts w:asciiTheme="minorHAnsi" w:eastAsia="Calibri" w:hAnsiTheme="minorHAnsi" w:cstheme="minorHAnsi"/>
+                <w:sz w:val="14"/>
+              </w:rPr>
+              <w:t>, India, UK, USA</w:t>
             </w:r>
           </w:p>
         </w:tc>
@@ -13680,7 +13845,6 @@
                 <w:rFonts w:asciiTheme="minorHAnsi" w:hAnsiTheme="minorHAnsi" w:cstheme="minorHAnsi"/>
               </w:rPr>
             </w:pPr>
-            <w:proofErr w:type="gramStart"/>
             <w:r>
               <w:rPr>
                 <w:rFonts w:asciiTheme="minorHAnsi" w:eastAsia="Calibri" w:hAnsiTheme="minorHAnsi" w:cstheme="minorHAnsi"/>
@@ -13688,7 +13852,6 @@
               </w:rPr>
               <w:t>Binaria objetivo</w:t>
             </w:r>
-            <w:proofErr w:type="gramEnd"/>
           </w:p>
         </w:tc>
         <w:tc>
@@ -23483,7 +23646,25 @@
           <w:szCs w:val="24"/>
           <w:lang w:val="es-419" w:eastAsia="es-419"/>
         </w:rPr>
-        <w:t xml:space="preserve">Alotaibi y Haq (2024) compararon distintos clasificadores para predecir abandono de clientes en telecomunicaciones, incluyendo Random Forest, </w:t>
+        <w:t xml:space="preserve">Alotaibi y Haq (2024) compararon distintos clasificadores para predecir abandono de clientes en telecomunicaciones, incluyendo </w:t>
+      </w:r>
+      <w:proofErr w:type="spellStart"/>
+      <w:r>
+        <w:rPr>
+          <w:rFonts w:asciiTheme="minorHAnsi" w:eastAsia="Times New Roman" w:hAnsiTheme="minorHAnsi" w:cstheme="minorHAnsi"/>
+          <w:szCs w:val="24"/>
+          <w:lang w:val="es-419" w:eastAsia="es-419"/>
+        </w:rPr>
+        <w:t>Random</w:t>
+      </w:r>
+      <w:proofErr w:type="spellEnd"/>
+      <w:r>
+        <w:rPr>
+          <w:rFonts w:asciiTheme="minorHAnsi" w:eastAsia="Times New Roman" w:hAnsiTheme="minorHAnsi" w:cstheme="minorHAnsi"/>
+          <w:szCs w:val="24"/>
+          <w:lang w:val="es-419" w:eastAsia="es-419"/>
+        </w:rPr>
+        <w:t xml:space="preserve"> Forest, </w:t>
       </w:r>
       <w:proofErr w:type="spellStart"/>
       <w:r>
@@ -26227,6 +26408,7 @@
         <w:tc>
           <w:tcPr>
             <w:tcW w:w="1152" w:type="dxa"/>
+            <w:shd w:val="clear" w:color="auto" w:fill="EAF1DD" w:themeFill="accent3" w:themeFillTint="33"/>
           </w:tcPr>
           <w:p>
             <w:pPr>
@@ -26400,6 +26582,7 @@
         <w:tc>
           <w:tcPr>
             <w:tcW w:w="1152" w:type="dxa"/>
+            <w:shd w:val="clear" w:color="auto" w:fill="EAF1DD" w:themeFill="accent3" w:themeFillTint="33"/>
           </w:tcPr>
           <w:p>
             <w:pPr>
@@ -26532,6 +26715,7 @@
         <w:tc>
           <w:tcPr>
             <w:tcW w:w="1152" w:type="dxa"/>
+            <w:shd w:val="clear" w:color="auto" w:fill="EAF1DD" w:themeFill="accent3" w:themeFillTint="33"/>
           </w:tcPr>
           <w:p>
             <w:pPr>
@@ -26546,7 +26730,7 @@
                 <w:rFonts w:asciiTheme="minorHAnsi" w:hAnsiTheme="minorHAnsi" w:cstheme="minorHAnsi"/>
                 <w:sz w:val="14"/>
               </w:rPr>
-              <w:t>En curso</w:t>
+              <w:t>Completado</w:t>
             </w:r>
           </w:p>
         </w:tc>
@@ -33332,13 +33516,27 @@
           <w:rFonts w:asciiTheme="minorHAnsi" w:hAnsiTheme="minorHAnsi" w:cstheme="minorHAnsi"/>
         </w:rPr>
         <w:lastRenderedPageBreak/>
-        <w:t xml:space="preserve">la sensibilidad de forma consistente. SMOTE presentó resultados inferiores en Random Forest y </w:t>
+        <w:t xml:space="preserve">la sensibilidad de forma consistente. SMOTE presentó resultados inferiores en </w:t>
       </w:r>
       <w:proofErr w:type="spellStart"/>
       <w:r>
         <w:rPr>
           <w:rFonts w:asciiTheme="minorHAnsi" w:hAnsiTheme="minorHAnsi" w:cstheme="minorHAnsi"/>
         </w:rPr>
+        <w:t>Random</w:t>
+      </w:r>
+      <w:proofErr w:type="spellEnd"/>
+      <w:r>
+        <w:rPr>
+          <w:rFonts w:asciiTheme="minorHAnsi" w:hAnsiTheme="minorHAnsi" w:cstheme="minorHAnsi"/>
+        </w:rPr>
+        <w:t xml:space="preserve"> Forest y </w:t>
+      </w:r>
+      <w:proofErr w:type="spellStart"/>
+      <w:r>
+        <w:rPr>
+          <w:rFonts w:asciiTheme="minorHAnsi" w:hAnsiTheme="minorHAnsi" w:cstheme="minorHAnsi"/>
+        </w:rPr>
         <w:t>XGBoost</w:t>
       </w:r>
       <w:proofErr w:type="spellEnd"/>
@@ -33346,14 +33544,14 @@
         <w:rPr>
           <w:rFonts w:asciiTheme="minorHAnsi" w:hAnsiTheme="minorHAnsi" w:cstheme="minorHAnsi"/>
         </w:rPr>
-        <w:t>; una posible explicación es que la interpolación sobre variables one-</w:t>
+        <w:t xml:space="preserve">; una posible explicación es que la interpolación sobre variables </w:t>
       </w:r>
       <w:proofErr w:type="spellStart"/>
       <w:r>
         <w:rPr>
           <w:rFonts w:asciiTheme="minorHAnsi" w:hAnsiTheme="minorHAnsi" w:cstheme="minorHAnsi"/>
         </w:rPr>
-        <w:t>hot</w:t>
+        <w:t>one-hot</w:t>
       </w:r>
       <w:proofErr w:type="spellEnd"/>
       <w:r>
@@ -33761,14 +33959,14 @@
         <w:rPr>
           <w:rFonts w:asciiTheme="minorHAnsi" w:hAnsiTheme="minorHAnsi" w:cstheme="minorHAnsi"/>
         </w:rPr>
-        <w:t>Para facilitar la interpretación de los resultados, la aplicación complementa el gráfico técnico de SHAP con una explicación en lenguaje simple. Esta presenta por separado hasta tres factores que aumentan y tres que reducen el riesgo, incluyendo el valor real de cada variable. En las variables categóricas, las contribuciones generadas por el one-</w:t>
+        <w:t xml:space="preserve">Para facilitar la interpretación de los resultados, la aplicación complementa el gráfico técnico de SHAP con una explicación en lenguaje simple. Esta presenta por separado hasta tres factores que aumentan y tres que reducen el riesgo, incluyendo el valor real de cada variable. En las variables categóricas, las contribuciones generadas por el </w:t>
       </w:r>
       <w:proofErr w:type="spellStart"/>
       <w:r>
         <w:rPr>
           <w:rFonts w:asciiTheme="minorHAnsi" w:hAnsiTheme="minorHAnsi" w:cstheme="minorHAnsi"/>
         </w:rPr>
-        <w:t>hot</w:t>
+        <w:t>one-hot</w:t>
       </w:r>
       <w:proofErr w:type="spellEnd"/>
       <w:r>
@@ -34117,6 +34315,7 @@
       <w:r>
         <w:rPr>
           <w:rFonts w:asciiTheme="minorHAnsi" w:hAnsiTheme="minorHAnsi" w:cstheme="minorHAnsi"/>
+          <w:noProof/>
           <w:sz w:val="20"/>
         </w:rPr>
         <w:drawing>
@@ -34162,16 +34361,6 @@
         <w:jc w:val="center"/>
         <w:rPr>
           <w:rFonts w:asciiTheme="minorHAnsi" w:hAnsiTheme="minorHAnsi" w:cstheme="minorHAnsi"/>
-          <w:sz w:val="20"/>
-        </w:rPr>
-      </w:pPr>
-    </w:p>
-    <w:p>
-      <w:pPr>
-        <w:spacing w:before="80" w:after="40" w:line="276" w:lineRule="auto"/>
-        <w:jc w:val="center"/>
-        <w:rPr>
-          <w:rFonts w:asciiTheme="minorHAnsi" w:hAnsiTheme="minorHAnsi" w:cstheme="minorHAnsi"/>
         </w:rPr>
       </w:pPr>
       <w:r>
@@ -34212,6 +34401,7 @@
       <w:r>
         <w:rPr>
           <w:rFonts w:asciiTheme="minorHAnsi" w:hAnsiTheme="minorHAnsi" w:cstheme="minorHAnsi"/>
+          <w:noProof/>
           <w:sz w:val="20"/>
         </w:rPr>
         <w:drawing>
@@ -34263,6 +34453,7 @@
       <w:r>
         <w:rPr>
           <w:rFonts w:asciiTheme="minorHAnsi" w:hAnsiTheme="minorHAnsi" w:cstheme="minorHAnsi"/>
+          <w:noProof/>
           <w:sz w:val="20"/>
         </w:rPr>
         <w:drawing>
@@ -34361,7 +34552,9 @@
       <w:r>
         <w:rPr>
           <w:rFonts w:asciiTheme="minorHAnsi" w:hAnsiTheme="minorHAnsi" w:cstheme="minorHAnsi"/>
-        </w:rPr>
+          <w:noProof/>
+        </w:rPr>
+        <w:lastRenderedPageBreak/>
         <w:drawing>
           <wp:inline distT="0" distB="0" distL="0" distR="0" wp14:anchorId="069BF3BF" wp14:editId="27E29AC3">
             <wp:extent cx="4514850" cy="2723264"/>
@@ -34920,19 +35113,11 @@
                 <w:rFonts w:asciiTheme="minorHAnsi" w:hAnsiTheme="minorHAnsi" w:cstheme="minorHAnsi"/>
               </w:rPr>
             </w:pPr>
-            <w:proofErr w:type="gramStart"/>
-            <w:r>
-              <w:rPr>
-                <w:rFonts w:asciiTheme="minorHAnsi" w:hAnsiTheme="minorHAnsi" w:cstheme="minorHAnsi"/>
-              </w:rPr>
-              <w:t>Total</w:t>
-            </w:r>
-            <w:proofErr w:type="gramEnd"/>
-            <w:r>
-              <w:rPr>
-                <w:rFonts w:asciiTheme="minorHAnsi" w:hAnsiTheme="minorHAnsi" w:cstheme="minorHAnsi"/>
-              </w:rPr>
-              <w:t xml:space="preserve"> Válido</w:t>
+            <w:r>
+              <w:rPr>
+                <w:rFonts w:asciiTheme="minorHAnsi" w:hAnsiTheme="minorHAnsi" w:cstheme="minorHAnsi"/>
+              </w:rPr>
+              <w:t>Total Válido</w:t>
             </w:r>
           </w:p>
         </w:tc>
@@ -35064,14 +35249,7 @@
         <w:rPr>
           <w:rFonts w:asciiTheme="minorHAnsi" w:hAnsiTheme="minorHAnsi" w:cstheme="minorHAnsi"/>
         </w:rPr>
-        <w:t xml:space="preserve">Oportunidad preventiva: Existe un bolsón de 4 clientes (16%) en riesgo medio que permite ejecutar </w:t>
-      </w:r>
-      <w:r>
-        <w:rPr>
-          <w:rFonts w:asciiTheme="minorHAnsi" w:hAnsiTheme="minorHAnsi" w:cstheme="minorHAnsi"/>
-        </w:rPr>
-        <w:lastRenderedPageBreak/>
-        <w:t>campañas de mitigación temprana antes de que escalen a riesgo alto de fuga.</w:t>
+        <w:t>Oportunidad preventiva: Existe un bolsón de 4 clientes (16%) en riesgo medio que permite ejecutar campañas de mitigación temprana antes de que escalen a riesgo alto de fuga.</w:t>
       </w:r>
     </w:p>
     <w:p>
@@ -35094,6 +35272,7 @@
       <w:r>
         <w:rPr>
           <w:rFonts w:asciiTheme="minorHAnsi" w:hAnsiTheme="minorHAnsi" w:cstheme="minorHAnsi"/>
+          <w:noProof/>
         </w:rPr>
         <w:drawing>
           <wp:inline distT="0" distB="0" distL="0" distR="0" wp14:anchorId="683D7AF9" wp14:editId="545B4D0B">
@@ -35526,6 +35705,14 @@
           <w:rFonts w:asciiTheme="minorHAnsi" w:hAnsiTheme="minorHAnsi" w:cstheme="minorHAnsi"/>
         </w:rPr>
       </w:pPr>
+    </w:p>
+    <w:p>
+      <w:pPr>
+        <w:spacing w:line="276" w:lineRule="auto"/>
+        <w:rPr>
+          <w:rFonts w:asciiTheme="minorHAnsi" w:hAnsiTheme="minorHAnsi" w:cstheme="minorHAnsi"/>
+        </w:rPr>
+      </w:pPr>
       <w:r>
         <w:rPr>
           <w:rFonts w:asciiTheme="minorHAnsi" w:hAnsiTheme="minorHAnsi" w:cstheme="minorHAnsi"/>
@@ -38186,7 +38373,7 @@
                 <w:sz w:val="20"/>
                 <w:szCs w:val="20"/>
               </w:rPr>
-              <w:t>Pendiente de verificación</w:t>
+              <w:t>Completado</w:t>
             </w:r>
           </w:p>
         </w:tc>
@@ -38215,41 +38402,36 @@
                 <w:sz w:val="20"/>
                 <w:szCs w:val="20"/>
               </w:rPr>
-              <w:t>RF-14: dashboard y cartera priorizada.</w:t>
-            </w:r>
-          </w:p>
-        </w:tc>
-        <w:tc>
-          <w:tcPr>
-            <w:tcW w:w="4394" w:type="dxa"/>
-          </w:tcPr>
-          <w:p>
-            <w:pPr>
-              <w:spacing w:line="276" w:lineRule="auto"/>
-              <w:jc w:val="both"/>
+              <w:t xml:space="preserve">RF-14: </w:t>
+            </w:r>
+            <w:proofErr w:type="spellStart"/>
+            <w:r>
               <w:rPr>
                 <w:rFonts w:asciiTheme="minorHAnsi" w:hAnsiTheme="minorHAnsi" w:cstheme="minorHAnsi"/>
                 <w:sz w:val="20"/>
                 <w:szCs w:val="20"/>
               </w:rPr>
-            </w:pPr>
+              <w:t>dashboard</w:t>
+            </w:r>
+            <w:proofErr w:type="spellEnd"/>
             <w:r>
               <w:rPr>
                 <w:rFonts w:asciiTheme="minorHAnsi" w:hAnsiTheme="minorHAnsi" w:cstheme="minorHAnsi"/>
                 <w:sz w:val="20"/>
                 <w:szCs w:val="20"/>
               </w:rPr>
-              <w:t>Indicadores, filtros y ficha individual (Figuras 9 a 11).</w:t>
-            </w:r>
-          </w:p>
-        </w:tc>
-        <w:tc>
-          <w:tcPr>
-            <w:tcW w:w="1870" w:type="dxa"/>
-          </w:tcPr>
-          <w:p>
-            <w:pPr>
-              <w:spacing w:line="276" w:lineRule="auto"/>
+              <w:t xml:space="preserve"> y cartera priorizada.</w:t>
+            </w:r>
+          </w:p>
+        </w:tc>
+        <w:tc>
+          <w:tcPr>
+            <w:tcW w:w="4394" w:type="dxa"/>
+          </w:tcPr>
+          <w:p>
+            <w:pPr>
+              <w:spacing w:line="276" w:lineRule="auto"/>
+              <w:jc w:val="both"/>
               <w:rPr>
                 <w:rFonts w:asciiTheme="minorHAnsi" w:hAnsiTheme="minorHAnsi" w:cstheme="minorHAnsi"/>
                 <w:sz w:val="20"/>
@@ -38262,7 +38444,30 @@
                 <w:sz w:val="20"/>
                 <w:szCs w:val="20"/>
               </w:rPr>
-              <w:t>Pendiente de verificación</w:t>
+              <w:t>Indicadores, filtros y ficha individual (Figuras 9 a 11).</w:t>
+            </w:r>
+          </w:p>
+        </w:tc>
+        <w:tc>
+          <w:tcPr>
+            <w:tcW w:w="1870" w:type="dxa"/>
+          </w:tcPr>
+          <w:p>
+            <w:pPr>
+              <w:spacing w:line="276" w:lineRule="auto"/>
+              <w:rPr>
+                <w:rFonts w:asciiTheme="minorHAnsi" w:hAnsiTheme="minorHAnsi" w:cstheme="minorHAnsi"/>
+                <w:sz w:val="20"/>
+                <w:szCs w:val="20"/>
+              </w:rPr>
+            </w:pPr>
+            <w:r>
+              <w:rPr>
+                <w:rFonts w:asciiTheme="minorHAnsi" w:hAnsiTheme="minorHAnsi" w:cstheme="minorHAnsi"/>
+                <w:sz w:val="20"/>
+                <w:szCs w:val="20"/>
+              </w:rPr>
+              <w:t>Completado</w:t>
             </w:r>
           </w:p>
         </w:tc>
@@ -38334,7 +38539,7 @@
 </file>
 
 <file path=word/endnotes.xml><?xml version="1.0" encoding="utf-8"?>
-<w:endnotes xmlns:wpc="http://schemas.microsoft.com/office/word/2010/wordprocessingCanvas" xmlns:cx="http://schemas.microsoft.com/office/drawing/2014/chartex" xmlns:cx1="http://schemas.microsoft.com/office/drawing/2015/9/8/chartex" xmlns:cx2="http://schemas.microsoft.com/office/drawing/2015/10/21/chartex" xmlns:cx3="http://schemas.microsoft.com/office/drawing/2016/5/9/chartex" xmlns:cx4="http://schemas.microsoft.com/office/drawing/2016/5/10/chartex" xmlns:cx5="http://schemas.microsoft.com/office/drawing/2016/5/11/chartex" xmlns:cx6="http://schemas.microsoft.com/office/drawing/2016/5/12/chartex" xmlns:cx7="http://schemas.microsoft.com/office/drawing/2016/5/13/chartex" xmlns:cx8="http://schemas.microsoft.com/office/drawing/2016/5/14/chartex" xmlns:mc="http://schemas.openxmlformats.org/markup-compatibility/2006" xmlns:aink="http://schemas.microsoft.com/office/drawing/2016/ink" xmlns:am3d="http://schemas.microsoft.com/office/drawing/2017/model3d" xmlns:o="urn:schemas-microsoft-com:office:office" xmlns:oel="http://schemas.microsoft.com/office/2019/extlst" xmlns:r="http://schemas.openxmlformats.org/officeDocument/2006/relationships" xmlns:m="http://schemas.openxmlformats.org/officeDocument/2006/math" xmlns:v="urn:schemas-microsoft-com:vml" xmlns:wp14="http://schemas.microsoft.com/office/word/2010/wordprocessingDrawing" xmlns:wp="http://schemas.openxmlformats.org/drawingml/2006/wordprocessingDrawing" xmlns:w10="urn:schemas-microsoft-com:office:word" xmlns:w="http://schemas.openxmlformats.org/wordprocessingml/2006/main" xmlns:w14="http://schemas.microsoft.com/office/word/2010/wordml" xmlns:w15="http://schemas.microsoft.com/office/word/2012/wordml" xmlns:w16cei="http://schemas.microsoft.com/office/word/2026/wordml/cei" xmlns:w16cex="http://schemas.microsoft.com/office/word/2018/wordml/cex" xmlns:w16cid="http://schemas.microsoft.com/office/word/2016/wordml/cid" xmlns:w16="http://schemas.microsoft.com/office/word/2018/wordml" xmlns:w16du="http://schemas.microsoft.com/office/word/2023/wordml/word16du" xmlns:w16sdtdh="http://schemas.microsoft.com/office/word/2020/wordml/sdtdatahash" xmlns:w16sdtfl="http://schemas.microsoft.com/office/word/2024/wordml/sdtformatlock" xmlns:w16se="http://schemas.microsoft.com/office/word/2015/wordml/symex" xmlns:wpg="http://schemas.microsoft.com/office/word/2010/wordprocessingGroup" xmlns:wpi="http://schemas.microsoft.com/office/word/2010/wordprocessingInk" xmlns:wne="http://schemas.microsoft.com/office/word/2006/wordml" xmlns:wps="http://schemas.microsoft.com/office/word/2010/wordprocessingShape" mc:Ignorable="w14 w15 w16se w16cid w16 w16cex w16sdtdh w16sdtfl w16du wp14">
+<w:endnotes xmlns:wpc="http://schemas.microsoft.com/office/word/2010/wordprocessingCanvas" xmlns:cx="http://schemas.microsoft.com/office/drawing/2014/chartex" xmlns:cx1="http://schemas.microsoft.com/office/drawing/2015/9/8/chartex" xmlns:cx2="http://schemas.microsoft.com/office/drawing/2015/10/21/chartex" xmlns:cx3="http://schemas.microsoft.com/office/drawing/2016/5/9/chartex" xmlns:cx4="http://schemas.microsoft.com/office/drawing/2016/5/10/chartex" xmlns:cx5="http://schemas.microsoft.com/office/drawing/2016/5/11/chartex" xmlns:cx6="http://schemas.microsoft.com/office/drawing/2016/5/12/chartex" xmlns:cx7="http://schemas.microsoft.com/office/drawing/2016/5/13/chartex" xmlns:cx8="http://schemas.microsoft.com/office/drawing/2016/5/14/chartex" xmlns:mc="http://schemas.openxmlformats.org/markup-compatibility/2006" xmlns:aink="http://schemas.microsoft.com/office/drawing/2016/ink" xmlns:am3d="http://schemas.microsoft.com/office/drawing/2017/model3d" xmlns:o="urn:schemas-microsoft-com:office:office" xmlns:r="http://schemas.openxmlformats.org/officeDocument/2006/relationships" xmlns:m="http://schemas.openxmlformats.org/officeDocument/2006/math" xmlns:v="urn:schemas-microsoft-com:vml" xmlns:wp14="http://schemas.microsoft.com/office/word/2010/wordprocessingDrawing" xmlns:wp="http://schemas.openxmlformats.org/drawingml/2006/wordprocessingDrawing" xmlns:w10="urn:schemas-microsoft-com:office:word" xmlns:w="http://schemas.openxmlformats.org/wordprocessingml/2006/main" xmlns:w14="http://schemas.microsoft.com/office/word/2010/wordml" xmlns:w15="http://schemas.microsoft.com/office/word/2012/wordml" xmlns:w16cex="http://schemas.microsoft.com/office/word/2018/wordml/cex" xmlns:w16cid="http://schemas.microsoft.com/office/word/2016/wordml/cid" xmlns:w16="http://schemas.microsoft.com/office/word/2018/wordml" xmlns:w16sdtdh="http://schemas.microsoft.com/office/word/2020/wordml/sdtdatahash" xmlns:w16se="http://schemas.microsoft.com/office/word/2015/wordml/symex" xmlns:wpg="http://schemas.microsoft.com/office/word/2010/wordprocessingGroup" xmlns:wpi="http://schemas.microsoft.com/office/word/2010/wordprocessingInk" xmlns:wne="http://schemas.microsoft.com/office/word/2006/wordml" xmlns:wps="http://schemas.microsoft.com/office/word/2010/wordprocessingShape" mc:Ignorable="w14 w15 w16se w16cid w16 w16cex w16sdtdh wp14">
   <w:endnote w:type="separator" w:id="-1">
     <w:p>
       <w:r>
@@ -38353,7 +38558,7 @@
 </file>
 
 <file path=word/footer1.xml><?xml version="1.0" encoding="utf-8"?>
-<w:ftr xmlns:wpc="http://schemas.microsoft.com/office/word/2010/wordprocessingCanvas" xmlns:cx="http://schemas.microsoft.com/office/drawing/2014/chartex" xmlns:cx1="http://schemas.microsoft.com/office/drawing/2015/9/8/chartex" xmlns:cx2="http://schemas.microsoft.com/office/drawing/2015/10/21/chartex" xmlns:cx3="http://schemas.microsoft.com/office/drawing/2016/5/9/chartex" xmlns:cx4="http://schemas.microsoft.com/office/drawing/2016/5/10/chartex" xmlns:cx5="http://schemas.microsoft.com/office/drawing/2016/5/11/chartex" xmlns:cx6="http://schemas.microsoft.com/office/drawing/2016/5/12/chartex" xmlns:cx7="http://schemas.microsoft.com/office/drawing/2016/5/13/chartex" xmlns:cx8="http://schemas.microsoft.com/office/drawing/2016/5/14/chartex" xmlns:mc="http://schemas.openxmlformats.org/markup-compatibility/2006" xmlns:aink="http://schemas.microsoft.com/office/drawing/2016/ink" xmlns:am3d="http://schemas.microsoft.com/office/drawing/2017/model3d" xmlns:o="urn:schemas-microsoft-com:office:office" xmlns:oel="http://schemas.microsoft.com/office/2019/extlst" xmlns:r="http://schemas.openxmlformats.org/officeDocument/2006/relationships" xmlns:m="http://schemas.openxmlformats.org/officeDocument/2006/math" xmlns:v="urn:schemas-microsoft-com:vml" xmlns:wp14="http://schemas.microsoft.com/office/word/2010/wordprocessingDrawing" xmlns:wp="http://schemas.openxmlformats.org/drawingml/2006/wordprocessingDrawing" xmlns:w10="urn:schemas-microsoft-com:office:word" xmlns:w="http://schemas.openxmlformats.org/wordprocessingml/2006/main" xmlns:w14="http://schemas.microsoft.com/office/word/2010/wordml" xmlns:w15="http://schemas.microsoft.com/office/word/2012/wordml" xmlns:w16cei="http://schemas.microsoft.com/office/word/2026/wordml/cei" xmlns:w16cex="http://schemas.microsoft.com/office/word/2018/wordml/cex" xmlns:w16cid="http://schemas.microsoft.com/office/word/2016/wordml/cid" xmlns:w16="http://schemas.microsoft.com/office/word/2018/wordml" xmlns:w16du="http://schemas.microsoft.com/office/word/2023/wordml/word16du" xmlns:w16sdtdh="http://schemas.microsoft.com/office/word/2020/wordml/sdtdatahash" xmlns:w16sdtfl="http://schemas.microsoft.com/office/word/2024/wordml/sdtformatlock" xmlns:w16se="http://schemas.microsoft.com/office/word/2015/wordml/symex" xmlns:wpg="http://schemas.microsoft.com/office/word/2010/wordprocessingGroup" xmlns:wpi="http://schemas.microsoft.com/office/word/2010/wordprocessingInk" xmlns:wne="http://schemas.microsoft.com/office/word/2006/wordml" xmlns:wps="http://schemas.microsoft.com/office/word/2010/wordprocessingShape" mc:Ignorable="w14 w15 w16se w16cid w16 w16cex w16sdtdh w16sdtfl w16du wp14">
+<w:ftr xmlns:wpc="http://schemas.microsoft.com/office/word/2010/wordprocessingCanvas" xmlns:cx="http://schemas.microsoft.com/office/drawing/2014/chartex" xmlns:cx1="http://schemas.microsoft.com/office/drawing/2015/9/8/chartex" xmlns:cx2="http://schemas.microsoft.com/office/drawing/2015/10/21/chartex" xmlns:cx3="http://schemas.microsoft.com/office/drawing/2016/5/9/chartex" xmlns:cx4="http://schemas.microsoft.com/office/drawing/2016/5/10/chartex" xmlns:cx5="http://schemas.microsoft.com/office/drawing/2016/5/11/chartex" xmlns:cx6="http://schemas.microsoft.com/office/drawing/2016/5/12/chartex" xmlns:cx7="http://schemas.microsoft.com/office/drawing/2016/5/13/chartex" xmlns:cx8="http://schemas.microsoft.com/office/drawing/2016/5/14/chartex" xmlns:mc="http://schemas.openxmlformats.org/markup-compatibility/2006" xmlns:aink="http://schemas.microsoft.com/office/drawing/2016/ink" xmlns:am3d="http://schemas.microsoft.com/office/drawing/2017/model3d" xmlns:o="urn:schemas-microsoft-com:office:office" xmlns:r="http://schemas.openxmlformats.org/officeDocument/2006/relationships" xmlns:m="http://schemas.openxmlformats.org/officeDocument/2006/math" xmlns:v="urn:schemas-microsoft-com:vml" xmlns:wp14="http://schemas.microsoft.com/office/word/2010/wordprocessingDrawing" xmlns:wp="http://schemas.openxmlformats.org/drawingml/2006/wordprocessingDrawing" xmlns:w10="urn:schemas-microsoft-com:office:word" xmlns:w="http://schemas.openxmlformats.org/wordprocessingml/2006/main" xmlns:w14="http://schemas.microsoft.com/office/word/2010/wordml" xmlns:w15="http://schemas.microsoft.com/office/word/2012/wordml" xmlns:w16cex="http://schemas.microsoft.com/office/word/2018/wordml/cex" xmlns:w16cid="http://schemas.microsoft.com/office/word/2016/wordml/cid" xmlns:w16="http://schemas.microsoft.com/office/word/2018/wordml" xmlns:w16sdtdh="http://schemas.microsoft.com/office/word/2020/wordml/sdtdatahash" xmlns:w16se="http://schemas.microsoft.com/office/word/2015/wordml/symex" xmlns:wpg="http://schemas.microsoft.com/office/word/2010/wordprocessingGroup" xmlns:wpi="http://schemas.microsoft.com/office/word/2010/wordprocessingInk" xmlns:wne="http://schemas.microsoft.com/office/word/2006/wordml" xmlns:wps="http://schemas.microsoft.com/office/word/2010/wordprocessingShape" mc:Ignorable="w14 w15 w16se w16cid w16 w16cex w16sdtdh wp14">
   <w:p>
     <w:pPr>
       <w:pStyle w:val="Textoindependiente"/>
@@ -38479,7 +38684,7 @@
             </wp:anchor>
           </w:drawing>
         </mc:Choice>
-        <mc:Fallback>
+        <mc:Fallback xmlns:w16sdtfl="http://schemas.microsoft.com/office/word/2024/wordml/sdtformatlock" xmlns:w16du="http://schemas.microsoft.com/office/word/2023/wordml/word16du" xmlns:w16cei="http://schemas.microsoft.com/office/word/2026/wordml/cei" xmlns:oel="http://schemas.microsoft.com/office/2019/extlst">
           <w:pict>
             <v:shape w14:anchorId="7CC05376" id="Graphic 17" o:spid="_x0000_s1026" style="position:absolute;margin-left:42.5pt;margin-top:739.9pt;width:218.15pt;height:.1pt;z-index:-15813632;visibility:visible;mso-wrap-style:square;mso-wrap-distance-left:0;mso-wrap-distance-top:0;mso-wrap-distance-right:0;mso-wrap-distance-bottom:0;mso-position-horizontal:absolute;mso-position-horizontal-relative:page;mso-position-vertical:absolute;mso-position-vertical-relative:page;v-text-anchor:top" coordsize="2770505,1270" o:gfxdata="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" path="m,l2770204,e" filled="f" strokecolor="#1d4b63">
               <v:path arrowok="t"/>
@@ -38558,7 +38763,7 @@
             </wp:anchor>
           </w:drawing>
         </mc:Choice>
-        <mc:Fallback>
+        <mc:Fallback xmlns:w16sdtfl="http://schemas.microsoft.com/office/word/2024/wordml/sdtformatlock" xmlns:w16du="http://schemas.microsoft.com/office/word/2023/wordml/word16du" xmlns:w16cei="http://schemas.microsoft.com/office/word/2026/wordml/cei" xmlns:oel="http://schemas.microsoft.com/office/2019/extlst">
           <w:pict>
             <v:shape w14:anchorId="4814CA64" id="Graphic 18" o:spid="_x0000_s1026" style="position:absolute;margin-left:371.35pt;margin-top:739.9pt;width:198.15pt;height:.1pt;z-index:-15813120;visibility:visible;mso-wrap-style:square;mso-wrap-distance-left:0;mso-wrap-distance-top:0;mso-wrap-distance-right:0;mso-wrap-distance-bottom:0;mso-position-horizontal:absolute;mso-position-horizontal-relative:page;mso-position-vertical:absolute;mso-position-vertical-relative:page;v-text-anchor:top" coordsize="2516505,1270" o:gfxdata="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" path="m,l2516399,e" filled="f" strokecolor="#1d4b63">
               <v:path arrowok="t"/>
@@ -38573,7 +38778,7 @@
 </file>
 
 <file path=word/footnotes.xml><?xml version="1.0" encoding="utf-8"?>
-<w:footnotes xmlns:wpc="http://schemas.microsoft.com/office/word/2010/wordprocessingCanvas" xmlns:cx="http://schemas.microsoft.com/office/drawing/2014/chartex" xmlns:cx1="http://schemas.microsoft.com/office/drawing/2015/9/8/chartex" xmlns:cx2="http://schemas.microsoft.com/office/drawing/2015/10/21/chartex" xmlns:cx3="http://schemas.microsoft.com/office/drawing/2016/5/9/chartex" xmlns:cx4="http://schemas.microsoft.com/office/drawing/2016/5/10/chartex" xmlns:cx5="http://schemas.microsoft.com/office/drawing/2016/5/11/chartex" xmlns:cx6="http://schemas.microsoft.com/office/drawing/2016/5/12/chartex" xmlns:cx7="http://schemas.microsoft.com/office/drawing/2016/5/13/chartex" xmlns:cx8="http://schemas.microsoft.com/office/drawing/2016/5/14/chartex" xmlns:mc="http://schemas.openxmlformats.org/markup-compatibility/2006" xmlns:aink="http://schemas.microsoft.com/office/drawing/2016/ink" xmlns:am3d="http://schemas.microsoft.com/office/drawing/2017/model3d" xmlns:o="urn:schemas-microsoft-com:office:office" xmlns:oel="http://schemas.microsoft.com/office/2019/extlst" xmlns:r="http://schemas.openxmlformats.org/officeDocument/2006/relationships" xmlns:m="http://schemas.openxmlformats.org/officeDocument/2006/math" xmlns:v="urn:schemas-microsoft-com:vml" xmlns:wp14="http://schemas.microsoft.com/office/word/2010/wordprocessingDrawing" xmlns:wp="http://schemas.openxmlformats.org/drawingml/2006/wordprocessingDrawing" xmlns:w10="urn:schemas-microsoft-com:office:word" xmlns:w="http://schemas.openxmlformats.org/wordprocessingml/2006/main" xmlns:w14="http://schemas.microsoft.com/office/word/2010/wordml" xmlns:w15="http://schemas.microsoft.com/office/word/2012/wordml" xmlns:w16cei="http://schemas.microsoft.com/office/word/2026/wordml/cei" xmlns:w16cex="http://schemas.microsoft.com/office/word/2018/wordml/cex" xmlns:w16cid="http://schemas.microsoft.com/office/word/2016/wordml/cid" xmlns:w16="http://schemas.microsoft.com/office/word/2018/wordml" xmlns:w16du="http://schemas.microsoft.com/office/word/2023/wordml/word16du" xmlns:w16sdtdh="http://schemas.microsoft.com/office/word/2020/wordml/sdtdatahash" xmlns:w16sdtfl="http://schemas.microsoft.com/office/word/2024/wordml/sdtformatlock" xmlns:w16se="http://schemas.microsoft.com/office/word/2015/wordml/symex" xmlns:wpg="http://schemas.microsoft.com/office/word/2010/wordprocessingGroup" xmlns:wpi="http://schemas.microsoft.com/office/word/2010/wordprocessingInk" xmlns:wne="http://schemas.microsoft.com/office/word/2006/wordml" xmlns:wps="http://schemas.microsoft.com/office/word/2010/wordprocessingShape" mc:Ignorable="w14 w15 w16se w16cid w16 w16cex w16sdtdh w16sdtfl w16du wp14">
+<w:footnotes xmlns:wpc="http://schemas.microsoft.com/office/word/2010/wordprocessingCanvas" xmlns:cx="http://schemas.microsoft.com/office/drawing/2014/chartex" xmlns:cx1="http://schemas.microsoft.com/office/drawing/2015/9/8/chartex" xmlns:cx2="http://schemas.microsoft.com/office/drawing/2015/10/21/chartex" xmlns:cx3="http://schemas.microsoft.com/office/drawing/2016/5/9/chartex" xmlns:cx4="http://schemas.microsoft.com/office/drawing/2016/5/10/chartex" xmlns:cx5="http://schemas.microsoft.com/office/drawing/2016/5/11/chartex" xmlns:cx6="http://schemas.microsoft.com/office/drawing/2016/5/12/chartex" xmlns:cx7="http://schemas.microsoft.com/office/drawing/2016/5/13/chartex" xmlns:cx8="http://schemas.microsoft.com/office/drawing/2016/5/14/chartex" xmlns:mc="http://schemas.openxmlformats.org/markup-compatibility/2006" xmlns:aink="http://schemas.microsoft.com/office/drawing/2016/ink" xmlns:am3d="http://schemas.microsoft.com/office/drawing/2017/model3d" xmlns:o="urn:schemas-microsoft-com:office:office" xmlns:r="http://schemas.openxmlformats.org/officeDocument/2006/relationships" xmlns:m="http://schemas.openxmlformats.org/officeDocument/2006/math" xmlns:v="urn:schemas-microsoft-com:vml" xmlns:wp14="http://schemas.microsoft.com/office/word/2010/wordprocessingDrawing" xmlns:wp="http://schemas.openxmlformats.org/drawingml/2006/wordprocessingDrawing" xmlns:w10="urn:schemas-microsoft-com:office:word" xmlns:w="http://schemas.openxmlformats.org/wordprocessingml/2006/main" xmlns:w14="http://schemas.microsoft.com/office/word/2010/wordml" xmlns:w15="http://schemas.microsoft.com/office/word/2012/wordml" xmlns:w16cex="http://schemas.microsoft.com/office/word/2018/wordml/cex" xmlns:w16cid="http://schemas.microsoft.com/office/word/2016/wordml/cid" xmlns:w16="http://schemas.microsoft.com/office/word/2018/wordml" xmlns:w16sdtdh="http://schemas.microsoft.com/office/word/2020/wordml/sdtdatahash" xmlns:w16se="http://schemas.microsoft.com/office/word/2015/wordml/symex" xmlns:wpg="http://schemas.microsoft.com/office/word/2010/wordprocessingGroup" xmlns:wpi="http://schemas.microsoft.com/office/word/2010/wordprocessingInk" xmlns:wne="http://schemas.microsoft.com/office/word/2006/wordml" xmlns:wps="http://schemas.microsoft.com/office/word/2010/wordprocessingShape" mc:Ignorable="w14 w15 w16se w16cid w16 w16cex w16sdtdh wp14">
   <w:footnote w:type="separator" w:id="-1">
     <w:p>
       <w:r>
@@ -38592,7 +38797,7 @@
 </file>
 
 <file path=word/header1.xml><?xml version="1.0" encoding="utf-8"?>
-<w:hdr xmlns:wpc="http://schemas.microsoft.com/office/word/2010/wordprocessingCanvas" xmlns:cx="http://schemas.microsoft.com/office/drawing/2014/chartex" xmlns:cx1="http://schemas.microsoft.com/office/drawing/2015/9/8/chartex" xmlns:cx2="http://schemas.microsoft.com/office/drawing/2015/10/21/chartex" xmlns:cx3="http://schemas.microsoft.com/office/drawing/2016/5/9/chartex" xmlns:cx4="http://schemas.microsoft.com/office/drawing/2016/5/10/chartex" xmlns:cx5="http://schemas.microsoft.com/office/drawing/2016/5/11/chartex" xmlns:cx6="http://schemas.microsoft.com/office/drawing/2016/5/12/chartex" xmlns:cx7="http://schemas.microsoft.com/office/drawing/2016/5/13/chartex" xmlns:cx8="http://schemas.microsoft.com/office/drawing/2016/5/14/chartex" xmlns:mc="http://schemas.openxmlformats.org/markup-compatibility/2006" xmlns:aink="http://schemas.microsoft.com/office/drawing/2016/ink" xmlns:am3d="http://schemas.microsoft.com/office/drawing/2017/model3d" xmlns:o="urn:schemas-microsoft-com:office:office" xmlns:oel="http://schemas.microsoft.com/office/2019/extlst" xmlns:r="http://schemas.openxmlformats.org/officeDocument/2006/relationships" xmlns:m="http://schemas.openxmlformats.org/officeDocument/2006/math" xmlns:v="urn:schemas-microsoft-com:vml" xmlns:wp14="http://schemas.microsoft.com/office/word/2010/wordprocessingDrawing" xmlns:wp="http://schemas.openxmlformats.org/drawingml/2006/wordprocessingDrawing" xmlns:w10="urn:schemas-microsoft-com:office:word" xmlns:w="http://schemas.openxmlformats.org/wordprocessingml/2006/main" xmlns:w14="http://schemas.microsoft.com/office/word/2010/wordml" xmlns:w15="http://schemas.microsoft.com/office/word/2012/wordml" xmlns:w16cei="http://schemas.microsoft.com/office/word/2026/wordml/cei" xmlns:w16cex="http://schemas.microsoft.com/office/word/2018/wordml/cex" xmlns:w16cid="http://schemas.microsoft.com/office/word/2016/wordml/cid" xmlns:w16="http://schemas.microsoft.com/office/word/2018/wordml" xmlns:w16du="http://schemas.microsoft.com/office/word/2023/wordml/word16du" xmlns:w16sdtdh="http://schemas.microsoft.com/office/word/2020/wordml/sdtdatahash" xmlns:w16sdtfl="http://schemas.microsoft.com/office/word/2024/wordml/sdtformatlock" xmlns:w16se="http://schemas.microsoft.com/office/word/2015/wordml/symex" xmlns:wpg="http://schemas.microsoft.com/office/word/2010/wordprocessingGroup" xmlns:wpi="http://schemas.microsoft.com/office/word/2010/wordprocessingInk" xmlns:wne="http://schemas.microsoft.com/office/word/2006/wordml" xmlns:wps="http://schemas.microsoft.com/office/word/2010/wordprocessingShape" mc:Ignorable="w14 w15 w16se w16cid w16 w16cex w16sdtdh w16sdtfl w16du wp14">
+<w:hdr xmlns:wpc="http://schemas.microsoft.com/office/word/2010/wordprocessingCanvas" xmlns:cx="http://schemas.microsoft.com/office/drawing/2014/chartex" xmlns:cx1="http://schemas.microsoft.com/office/drawing/2015/9/8/chartex" xmlns:cx2="http://schemas.microsoft.com/office/drawing/2015/10/21/chartex" xmlns:cx3="http://schemas.microsoft.com/office/drawing/2016/5/9/chartex" xmlns:cx4="http://schemas.microsoft.com/office/drawing/2016/5/10/chartex" xmlns:cx5="http://schemas.microsoft.com/office/drawing/2016/5/11/chartex" xmlns:cx6="http://schemas.microsoft.com/office/drawing/2016/5/12/chartex" xmlns:cx7="http://schemas.microsoft.com/office/drawing/2016/5/13/chartex" xmlns:cx8="http://schemas.microsoft.com/office/drawing/2016/5/14/chartex" xmlns:mc="http://schemas.openxmlformats.org/markup-compatibility/2006" xmlns:aink="http://schemas.microsoft.com/office/drawing/2016/ink" xmlns:am3d="http://schemas.microsoft.com/office/drawing/2017/model3d" xmlns:o="urn:schemas-microsoft-com:office:office" xmlns:r="http://schemas.openxmlformats.org/officeDocument/2006/relationships" xmlns:m="http://schemas.openxmlformats.org/officeDocument/2006/math" xmlns:v="urn:schemas-microsoft-com:vml" xmlns:wp14="http://schemas.microsoft.com/office/word/2010/wordprocessingDrawing" xmlns:wp="http://schemas.openxmlformats.org/drawingml/2006/wordprocessingDrawing" xmlns:w10="urn:schemas-microsoft-com:office:word" xmlns:w="http://schemas.openxmlformats.org/wordprocessingml/2006/main" xmlns:w14="http://schemas.microsoft.com/office/word/2010/wordml" xmlns:w15="http://schemas.microsoft.com/office/word/2012/wordml" xmlns:w16cex="http://schemas.microsoft.com/office/word/2018/wordml/cex" xmlns:w16cid="http://schemas.microsoft.com/office/word/2016/wordml/cid" xmlns:w16="http://schemas.microsoft.com/office/word/2018/wordml" xmlns:w16sdtdh="http://schemas.microsoft.com/office/word/2020/wordml/sdtdatahash" xmlns:w16se="http://schemas.microsoft.com/office/word/2015/wordml/symex" xmlns:wpg="http://schemas.microsoft.com/office/word/2010/wordprocessingGroup" xmlns:wpi="http://schemas.microsoft.com/office/word/2010/wordprocessingInk" xmlns:wne="http://schemas.microsoft.com/office/word/2006/wordml" xmlns:wps="http://schemas.microsoft.com/office/word/2010/wordprocessingShape" mc:Ignorable="w14 w15 w16se w16cid w16 w16cex w16sdtdh wp14">
   <w:p>
     <w:pPr>
       <w:pStyle w:val="Textoindependiente"/>
@@ -38703,7 +38908,7 @@
             </wp:anchor>
           </w:drawing>
         </mc:Choice>
-        <mc:Fallback>
+        <mc:Fallback xmlns:w16sdtfl="http://schemas.microsoft.com/office/word/2024/wordml/sdtformatlock" xmlns:w16du="http://schemas.microsoft.com/office/word/2023/wordml/word16du" xmlns:w16cei="http://schemas.microsoft.com/office/word/2026/wordml/cei" xmlns:oel="http://schemas.microsoft.com/office/2019/extlst">
           <w:pict>
             <v:group w14:anchorId="76941FC7" id="Group 12" o:spid="_x0000_s1026" style="position:absolute;margin-left:42.5pt;margin-top:37.85pt;width:527pt;height:9.1pt;z-index:-15815168;mso-wrap-distance-left:0;mso-wrap-distance-right:0;mso-position-horizontal-relative:page;mso-position-vertical-relative:page" coordsize="66929,1155" o:gfxdata="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">
               <v:shape id="Graphic 13" o:spid="_x0000_s1027" style="position:absolute;left:539;top:551;width:66390;height:13;visibility:visible;mso-wrap-style:square;v-text-anchor:top" coordsize="6638925,1270" o:gfxdata="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" path="m,l6638404,e" filled="f" strokecolor="#1d4b63">
@@ -38782,7 +38987,7 @@
 </file>
 
 <file path=word/numbering.xml><?xml version="1.0" encoding="utf-8"?>
-<w:numbering xmlns:wpc="http://schemas.microsoft.com/office/word/2010/wordprocessingCanvas" xmlns:cx="http://schemas.microsoft.com/office/drawing/2014/chartex" xmlns:cx1="http://schemas.microsoft.com/office/drawing/2015/9/8/chartex" xmlns:cx2="http://schemas.microsoft.com/office/drawing/2015/10/21/chartex" xmlns:cx3="http://schemas.microsoft.com/office/drawing/2016/5/9/chartex" xmlns:cx4="http://schemas.microsoft.com/office/drawing/2016/5/10/chartex" xmlns:cx5="http://schemas.microsoft.com/office/drawing/2016/5/11/chartex" xmlns:cx6="http://schemas.microsoft.com/office/drawing/2016/5/12/chartex" xmlns:cx7="http://schemas.microsoft.com/office/drawing/2016/5/13/chartex" xmlns:cx8="http://schemas.microsoft.com/office/drawing/2016/5/14/chartex" xmlns:mc="http://schemas.openxmlformats.org/markup-compatibility/2006" xmlns:aink="http://schemas.microsoft.com/office/drawing/2016/ink" xmlns:am3d="http://schemas.microsoft.com/office/drawing/2017/model3d" xmlns:o="urn:schemas-microsoft-com:office:office" xmlns:oel="http://schemas.microsoft.com/office/2019/extlst" xmlns:r="http://schemas.openxmlformats.org/officeDocument/2006/relationships" xmlns:m="http://schemas.openxmlformats.org/officeDocument/2006/math" xmlns:v="urn:schemas-microsoft-com:vml" xmlns:wp14="http://schemas.microsoft.com/office/word/2010/wordprocessingDrawing" xmlns:wp="http://schemas.openxmlformats.org/drawingml/2006/wordprocessingDrawing" xmlns:w10="urn:schemas-microsoft-com:office:word" xmlns:w="http://schemas.openxmlformats.org/wordprocessingml/2006/main" xmlns:w14="http://schemas.microsoft.com/office/word/2010/wordml" xmlns:w15="http://schemas.microsoft.com/office/word/2012/wordml" xmlns:w16cei="http://schemas.microsoft.com/office/word/2026/wordml/cei" xmlns:w16cex="http://schemas.microsoft.com/office/word/2018/wordml/cex" xmlns:w16cid="http://schemas.microsoft.com/office/word/2016/wordml/cid" xmlns:w16="http://schemas.microsoft.com/office/word/2018/wordml" xmlns:w16du="http://schemas.microsoft.com/office/word/2023/wordml/word16du" xmlns:w16sdtdh="http://schemas.microsoft.com/office/word/2020/wordml/sdtdatahash" xmlns:w16sdtfl="http://schemas.microsoft.com/office/word/2024/wordml/sdtformatlock" xmlns:w16se="http://schemas.microsoft.com/office/word/2015/wordml/symex" xmlns:wpg="http://schemas.microsoft.com/office/word/2010/wordprocessingGroup" xmlns:wpi="http://schemas.microsoft.com/office/word/2010/wordprocessingInk" xmlns:wne="http://schemas.microsoft.com/office/word/2006/wordml" xmlns:wps="http://schemas.microsoft.com/office/word/2010/wordprocessingShape" mc:Ignorable="w14 w15 w16se w16cid w16 w16cex w16sdtdh w16sdtfl w16du wp14">
+<w:numbering xmlns:wpc="http://schemas.microsoft.com/office/word/2010/wordprocessingCanvas" xmlns:cx="http://schemas.microsoft.com/office/drawing/2014/chartex" xmlns:cx1="http://schemas.microsoft.com/office/drawing/2015/9/8/chartex" xmlns:cx2="http://schemas.microsoft.com/office/drawing/2015/10/21/chartex" xmlns:cx3="http://schemas.microsoft.com/office/drawing/2016/5/9/chartex" xmlns:cx4="http://schemas.microsoft.com/office/drawing/2016/5/10/chartex" xmlns:cx5="http://schemas.microsoft.com/office/drawing/2016/5/11/chartex" xmlns:cx6="http://schemas.microsoft.com/office/drawing/2016/5/12/chartex" xmlns:cx7="http://schemas.microsoft.com/office/drawing/2016/5/13/chartex" xmlns:cx8="http://schemas.microsoft.com/office/drawing/2016/5/14/chartex" xmlns:mc="http://schemas.openxmlformats.org/markup-compatibility/2006" xmlns:aink="http://schemas.microsoft.com/office/drawing/2016/ink" xmlns:am3d="http://schemas.microsoft.com/office/drawing/2017/model3d" xmlns:o="urn:schemas-microsoft-com:office:office" xmlns:r="http://schemas.openxmlformats.org/officeDocument/2006/relationships" xmlns:m="http://schemas.openxmlformats.org/officeDocument/2006/math" xmlns:v="urn:schemas-microsoft-com:vml" xmlns:wp14="http://schemas.microsoft.com/office/word/2010/wordprocessingDrawing" xmlns:wp="http://schemas.openxmlformats.org/drawingml/2006/wordprocessingDrawing" xmlns:w10="urn:schemas-microsoft-com:office:word" xmlns:w="http://schemas.openxmlformats.org/wordprocessingml/2006/main" xmlns:w14="http://schemas.microsoft.com/office/word/2010/wordml" xmlns:w15="http://schemas.microsoft.com/office/word/2012/wordml" xmlns:w16cex="http://schemas.microsoft.com/office/word/2018/wordml/cex" xmlns:w16cid="http://schemas.microsoft.com/office/word/2016/wordml/cid" xmlns:w16="http://schemas.microsoft.com/office/word/2018/wordml" xmlns:w16sdtdh="http://schemas.microsoft.com/office/word/2020/wordml/sdtdatahash" xmlns:w16se="http://schemas.microsoft.com/office/word/2015/wordml/symex" xmlns:wpg="http://schemas.microsoft.com/office/word/2010/wordprocessingGroup" xmlns:wpi="http://schemas.microsoft.com/office/word/2010/wordprocessingInk" xmlns:wne="http://schemas.microsoft.com/office/word/2006/wordml" xmlns:wps="http://schemas.microsoft.com/office/word/2010/wordprocessingShape" mc:Ignorable="w14 w15 w16se w16cid w16 w16cex w16sdtdh wp14">
   <w:abstractNum w:abstractNumId="0" w15:restartNumberingAfterBreak="0">
     <w:nsid w:val="04572209"/>
     <w:multiLevelType w:val="multilevel"/>
@@ -40475,13 +40680,13 @@
       </w:pPr>
     </w:lvl>
   </w:abstractNum>
-  <w:num w:numId="1" w16cid:durableId="24598284">
+  <w:num w:numId="1">
     <w:abstractNumId w:val="4"/>
   </w:num>
-  <w:num w:numId="2" w16cid:durableId="811092811">
+  <w:num w:numId="2">
     <w:abstractNumId w:val="1"/>
   </w:num>
-  <w:num w:numId="3" w16cid:durableId="1498769880">
+  <w:num w:numId="3">
     <w:abstractNumId w:val="11"/>
     <w:lvlOverride w:ilvl="0">
       <w:startOverride w:val="1"/>
@@ -40511,41 +40716,41 @@
       <w:startOverride w:val="1"/>
     </w:lvlOverride>
   </w:num>
-  <w:num w:numId="4" w16cid:durableId="1807430067">
+  <w:num w:numId="4">
     <w:abstractNumId w:val="9"/>
   </w:num>
-  <w:num w:numId="5" w16cid:durableId="1665546228">
+  <w:num w:numId="5">
     <w:abstractNumId w:val="12"/>
   </w:num>
-  <w:num w:numId="6" w16cid:durableId="1816603970">
+  <w:num w:numId="6">
     <w:abstractNumId w:val="3"/>
   </w:num>
-  <w:num w:numId="7" w16cid:durableId="831063559">
+  <w:num w:numId="7">
     <w:abstractNumId w:val="7"/>
   </w:num>
-  <w:num w:numId="8" w16cid:durableId="1479609733">
+  <w:num w:numId="8">
     <w:abstractNumId w:val="0"/>
   </w:num>
-  <w:num w:numId="9" w16cid:durableId="751850903">
+  <w:num w:numId="9">
     <w:abstractNumId w:val="2"/>
   </w:num>
-  <w:num w:numId="10" w16cid:durableId="1265304550">
+  <w:num w:numId="10">
     <w:abstractNumId w:val="10"/>
   </w:num>
-  <w:num w:numId="11" w16cid:durableId="450631263">
+  <w:num w:numId="11">
     <w:abstractNumId w:val="8"/>
   </w:num>
-  <w:num w:numId="12" w16cid:durableId="1315182457">
+  <w:num w:numId="12">
     <w:abstractNumId w:val="6"/>
   </w:num>
-  <w:num w:numId="13" w16cid:durableId="1899048283">
+  <w:num w:numId="13">
     <w:abstractNumId w:val="5"/>
   </w:num>
 </w:numbering>
 </file>
 
 <file path=word/styles.xml><?xml version="1.0" encoding="utf-8"?>
-<w:styles xmlns:mc="http://schemas.openxmlformats.org/markup-compatibility/2006" xmlns:r="http://schemas.openxmlformats.org/officeDocument/2006/relationships" xmlns:w="http://schemas.openxmlformats.org/wordprocessingml/2006/main" xmlns:w14="http://schemas.microsoft.com/office/word/2010/wordml" xmlns:w15="http://schemas.microsoft.com/office/word/2012/wordml" xmlns:w16cex="http://schemas.microsoft.com/office/word/2018/wordml/cex" xmlns:w16cid="http://schemas.microsoft.com/office/word/2016/wordml/cid" xmlns:w16="http://schemas.microsoft.com/office/word/2018/wordml" xmlns:w16du="http://schemas.microsoft.com/office/word/2023/wordml/word16du" xmlns:w16sdtdh="http://schemas.microsoft.com/office/word/2020/wordml/sdtdatahash" xmlns:w16sdtfl="http://schemas.microsoft.com/office/word/2024/wordml/sdtformatlock" xmlns:w16se="http://schemas.microsoft.com/office/word/2015/wordml/symex" mc:Ignorable="w14 w15 w16se w16cid w16 w16cex w16sdtdh w16sdtfl w16du">
+<w:styles xmlns:mc="http://schemas.openxmlformats.org/markup-compatibility/2006" xmlns:r="http://schemas.openxmlformats.org/officeDocument/2006/relationships" xmlns:w="http://schemas.openxmlformats.org/wordprocessingml/2006/main" xmlns:w14="http://schemas.microsoft.com/office/word/2010/wordml" xmlns:w15="http://schemas.microsoft.com/office/word/2012/wordml" xmlns:w16cex="http://schemas.microsoft.com/office/word/2018/wordml/cex" xmlns:w16cid="http://schemas.microsoft.com/office/word/2016/wordml/cid" xmlns:w16="http://schemas.microsoft.com/office/word/2018/wordml" xmlns:w16sdtdh="http://schemas.microsoft.com/office/word/2020/wordml/sdtdatahash" xmlns:w16se="http://schemas.microsoft.com/office/word/2015/wordml/symex" mc:Ignorable="w14 w15 w16se w16cid w16 w16cex w16sdtdh">
   <w:docDefaults>
     <w:rPrDefault>
       <w:rPr>
@@ -40953,6 +41158,7 @@
   <w:style w:type="character" w:default="1" w:styleId="Fuentedeprrafopredeter">
     <w:name w:val="Default Paragraph Font"/>
     <w:uiPriority w:val="1"/>
+    <w:semiHidden/>
     <w:unhideWhenUsed/>
   </w:style>
   <w:style w:type="table" w:default="1" w:styleId="Tablanormal">
@@ -41105,7 +41311,7 @@
       </w:tblBorders>
     </w:tblPr>
   </w:style>
-  <w:style w:type="character" w:styleId="Fuerte">
+  <w:style w:type="character" w:styleId="Textoennegrita">
     <w:name w:val="Strong"/>
     <w:basedOn w:val="Fuentedeprrafopredeter"/>
     <w:uiPriority w:val="22"/>
@@ -41553,10 +41759,6 @@
 </file>
 
 <file path=customXml/item1.xml><?xml version="1.0" encoding="utf-8"?>
-<b:Sources xmlns:b="http://schemas.openxmlformats.org/officeDocument/2006/bibliography" xmlns="http://schemas.openxmlformats.org/officeDocument/2006/bibliography" SelectedStyle="\APASixthEditionOfficeOnline.xsl" StyleName="APA" Version="6"/>
-</file>
-
-<file path=customXml/item2.xml><?xml version="1.0" encoding="utf-8"?>
 <p:properties xmlns:p="http://schemas.microsoft.com/office/2006/metadata/properties" xmlns:xsi="http://www.w3.org/2001/XMLSchema-instance" xmlns:pc="http://schemas.microsoft.com/office/infopath/2007/PartnerControls">
   <documentManagement>
     <TaxCatchAll xmlns="34e9bb24-f277-4b2e-b702-727ad1819a53" xsi:nil="true"/>
@@ -41567,13 +41769,17 @@
 </p:properties>
 </file>
 
-<file path=customXml/item3.xml><?xml version="1.0" encoding="utf-8"?>
+<file path=customXml/item2.xml><?xml version="1.0" encoding="utf-8"?>
 <?mso-contentType ?>
 <FormTemplates xmlns="http://schemas.microsoft.com/sharepoint/v3/contenttype/forms">
   <Display>DocumentLibraryForm</Display>
   <Edit>DocumentLibraryForm</Edit>
   <New>DocumentLibraryForm</New>
 </FormTemplates>
+</file>
+
+<file path=customXml/item3.xml><?xml version="1.0" encoding="utf-8"?>
+<b:Sources xmlns:b="http://schemas.openxmlformats.org/officeDocument/2006/bibliography" xmlns="http://schemas.openxmlformats.org/officeDocument/2006/bibliography" SelectedStyle="\APASixthEditionOfficeOnline.xsl" StyleName="APA" Version="6"/>
 </file>
 
 <file path=customXml/item4.xml><?xml version="1.0" encoding="utf-8"?>
@@ -41772,14 +41978,6 @@
 </file>
 
 <file path=customXml/itemProps1.xml><?xml version="1.0" encoding="utf-8"?>
-<ds:datastoreItem xmlns:ds="http://schemas.openxmlformats.org/officeDocument/2006/customXml" ds:itemID="{FACB83BB-458E-4CCB-91D7-35CFBA93934D}">
-  <ds:schemaRefs>
-    <ds:schemaRef ds:uri="http://schemas.openxmlformats.org/officeDocument/2006/bibliography"/>
-  </ds:schemaRefs>
-</ds:datastoreItem>
-</file>
-
-<file path=customXml/itemProps2.xml><?xml version="1.0" encoding="utf-8"?>
 <ds:datastoreItem xmlns:ds="http://schemas.openxmlformats.org/officeDocument/2006/customXml" ds:itemID="{662F60C8-4BC5-4139-BE63-6954D22D77BD}">
   <ds:schemaRefs>
     <ds:schemaRef ds:uri="http://schemas.microsoft.com/office/2006/metadata/properties"/>
@@ -41790,10 +41988,18 @@
 </ds:datastoreItem>
 </file>
 
-<file path=customXml/itemProps3.xml><?xml version="1.0" encoding="utf-8"?>
+<file path=customXml/itemProps2.xml><?xml version="1.0" encoding="utf-8"?>
 <ds:datastoreItem xmlns:ds="http://schemas.openxmlformats.org/officeDocument/2006/customXml" ds:itemID="{084C26D9-49C9-4ADB-A387-DA6079798921}">
   <ds:schemaRefs>
     <ds:schemaRef ds:uri="http://schemas.microsoft.com/sharepoint/v3/contenttype/forms"/>
+  </ds:schemaRefs>
+</ds:datastoreItem>
+</file>
+
+<file path=customXml/itemProps3.xml><?xml version="1.0" encoding="utf-8"?>
+<ds:datastoreItem xmlns:ds="http://schemas.openxmlformats.org/officeDocument/2006/customXml" ds:itemID="{FACB83BB-458E-4CCB-91D7-35CFBA93934D}">
+  <ds:schemaRefs>
+    <ds:schemaRef ds:uri="http://schemas.openxmlformats.org/officeDocument/2006/bibliography"/>
   </ds:schemaRefs>
 </ds:datastoreItem>
 </file>

</xml_diff>